<commit_message>
updating the integrated report
</commit_message>
<xml_diff>
--- a/G12D7_Integrated_Project.docx
+++ b/G12D7_Integrated_Project.docx
@@ -241,7 +241,6 @@
           <w:szCs w:val="28"/>
         </w:rPr>
       </w:pPr>
-      <w:proofErr w:type="spellStart"/>
       <w:r>
         <w:rPr>
           <w:rFonts w:ascii="Times New Roman" w:hAnsi="Times New Roman" w:cs="Times New Roman"/>
@@ -249,17 +248,7 @@
           <w:sz w:val="28"/>
           <w:szCs w:val="28"/>
         </w:rPr>
-        <w:t>Parvej</w:t>
-      </w:r>
-      <w:proofErr w:type="spellEnd"/>
-      <w:r>
-        <w:rPr>
-          <w:rFonts w:ascii="Times New Roman" w:hAnsi="Times New Roman" w:cs="Times New Roman"/>
-          <w:b/>
-          <w:sz w:val="28"/>
-          <w:szCs w:val="28"/>
-        </w:rPr>
-        <w:t xml:space="preserve"> Khan (EN22CS301697)</w:t>
+        <w:t>Parvej Khan (EN22CS301697)</w:t>
       </w:r>
     </w:p>
     <w:p>
@@ -280,27 +269,7 @@
           <w:sz w:val="28"/>
           <w:szCs w:val="28"/>
         </w:rPr>
-        <w:t xml:space="preserve">Sagar </w:t>
-      </w:r>
-      <w:proofErr w:type="spellStart"/>
-      <w:r>
-        <w:rPr>
-          <w:rFonts w:ascii="Times New Roman" w:hAnsi="Times New Roman" w:cs="Times New Roman"/>
-          <w:b/>
-          <w:sz w:val="28"/>
-          <w:szCs w:val="28"/>
-        </w:rPr>
-        <w:t>Hedav</w:t>
-      </w:r>
-      <w:proofErr w:type="spellEnd"/>
-      <w:r>
-        <w:rPr>
-          <w:rFonts w:ascii="Times New Roman" w:hAnsi="Times New Roman" w:cs="Times New Roman"/>
-          <w:b/>
-          <w:sz w:val="28"/>
-          <w:szCs w:val="28"/>
-        </w:rPr>
-        <w:t xml:space="preserve"> (EN22CS301837)</w:t>
+        <w:t>Sagar Hedav (EN22CS301837)</w:t>
       </w:r>
     </w:p>
     <w:p>
@@ -363,7 +332,37 @@
           <w:sz w:val="32"/>
           <w:szCs w:val="32"/>
         </w:rPr>
-        <w:t xml:space="preserve">Ajeet Singh Rajput, Shyam Patel, </w:t>
+        <w:t xml:space="preserve">Prof. </w:t>
+      </w:r>
+      <w:r>
+        <w:rPr>
+          <w:rFonts w:ascii="Times New Roman" w:eastAsia="Times New Roman" w:hAnsi="Times New Roman" w:cs="Times New Roman"/>
+          <w:b/>
+          <w:bCs/>
+          <w:sz w:val="32"/>
+          <w:szCs w:val="32"/>
+        </w:rPr>
+        <w:t xml:space="preserve">Ajeet Singh Rajput, </w:t>
+      </w:r>
+      <w:r>
+        <w:rPr>
+          <w:rFonts w:ascii="Times New Roman" w:eastAsia="Times New Roman" w:hAnsi="Times New Roman" w:cs="Times New Roman"/>
+          <w:b/>
+          <w:bCs/>
+          <w:sz w:val="32"/>
+          <w:szCs w:val="32"/>
+        </w:rPr>
+        <w:t xml:space="preserve">Prof. </w:t>
+      </w:r>
+      <w:r>
+        <w:rPr>
+          <w:rFonts w:ascii="Times New Roman" w:eastAsia="Times New Roman" w:hAnsi="Times New Roman" w:cs="Times New Roman"/>
+          <w:b/>
+          <w:bCs/>
+          <w:sz w:val="32"/>
+          <w:szCs w:val="32"/>
+        </w:rPr>
+        <w:t xml:space="preserve">Shyam Patel, </w:t>
       </w:r>
       <w:r>
         <w:rPr>
@@ -855,7 +854,6 @@
           <w:szCs w:val="28"/>
         </w:rPr>
       </w:pPr>
-      <w:proofErr w:type="spellStart"/>
       <w:r>
         <w:rPr>
           <w:rFonts w:ascii="Times New Roman" w:hAnsi="Times New Roman" w:cs="Times New Roman"/>
@@ -863,17 +861,7 @@
           <w:sz w:val="28"/>
           <w:szCs w:val="28"/>
         </w:rPr>
-        <w:t>Parvej</w:t>
-      </w:r>
-      <w:proofErr w:type="spellEnd"/>
-      <w:r>
-        <w:rPr>
-          <w:rFonts w:ascii="Times New Roman" w:hAnsi="Times New Roman" w:cs="Times New Roman"/>
-          <w:b/>
-          <w:sz w:val="28"/>
-          <w:szCs w:val="28"/>
-        </w:rPr>
-        <w:t xml:space="preserve"> Khan (EN22CS301697)</w:t>
+        <w:t>Parvej Khan (EN22CS301697)</w:t>
       </w:r>
     </w:p>
     <w:p>
@@ -894,27 +882,7 @@
           <w:sz w:val="28"/>
           <w:szCs w:val="28"/>
         </w:rPr>
-        <w:t xml:space="preserve">Sagar </w:t>
-      </w:r>
-      <w:proofErr w:type="spellStart"/>
-      <w:r>
-        <w:rPr>
-          <w:rFonts w:ascii="Times New Roman" w:hAnsi="Times New Roman" w:cs="Times New Roman"/>
-          <w:b/>
-          <w:sz w:val="28"/>
-          <w:szCs w:val="28"/>
-        </w:rPr>
-        <w:t>Hedav</w:t>
-      </w:r>
-      <w:proofErr w:type="spellEnd"/>
-      <w:r>
-        <w:rPr>
-          <w:rFonts w:ascii="Times New Roman" w:hAnsi="Times New Roman" w:cs="Times New Roman"/>
-          <w:b/>
-          <w:sz w:val="28"/>
-          <w:szCs w:val="28"/>
-        </w:rPr>
-        <w:t xml:space="preserve"> (EN22CS301837)</w:t>
+        <w:t>Sagar Hedav (EN22CS301837)</w:t>
       </w:r>
     </w:p>
     <w:p>
@@ -977,7 +945,37 @@
           <w:sz w:val="32"/>
           <w:szCs w:val="32"/>
         </w:rPr>
-        <w:t xml:space="preserve">Ajeet Singh Rajput, Shyam Patel, </w:t>
+        <w:t xml:space="preserve">Prof. </w:t>
+      </w:r>
+      <w:r>
+        <w:rPr>
+          <w:rFonts w:ascii="Times New Roman" w:eastAsia="Times New Roman" w:hAnsi="Times New Roman" w:cs="Times New Roman"/>
+          <w:b/>
+          <w:bCs/>
+          <w:sz w:val="32"/>
+          <w:szCs w:val="32"/>
+        </w:rPr>
+        <w:t xml:space="preserve">Ajeet Singh Rajput, </w:t>
+      </w:r>
+      <w:r>
+        <w:rPr>
+          <w:rFonts w:ascii="Times New Roman" w:eastAsia="Times New Roman" w:hAnsi="Times New Roman" w:cs="Times New Roman"/>
+          <w:b/>
+          <w:bCs/>
+          <w:sz w:val="32"/>
+          <w:szCs w:val="32"/>
+        </w:rPr>
+        <w:t xml:space="preserve">Prof. </w:t>
+      </w:r>
+      <w:r>
+        <w:rPr>
+          <w:rFonts w:ascii="Times New Roman" w:eastAsia="Times New Roman" w:hAnsi="Times New Roman" w:cs="Times New Roman"/>
+          <w:b/>
+          <w:bCs/>
+          <w:sz w:val="32"/>
+          <w:szCs w:val="32"/>
+        </w:rPr>
+        <w:t xml:space="preserve">Shyam Patel, </w:t>
       </w:r>
       <w:r>
         <w:rPr>
@@ -2036,7 +2034,6 @@
           <w:szCs w:val="28"/>
         </w:rPr>
       </w:pPr>
-      <w:proofErr w:type="spellStart"/>
       <w:r>
         <w:rPr>
           <w:rFonts w:ascii="Times New Roman" w:hAnsi="Times New Roman" w:cs="Times New Roman"/>
@@ -2044,17 +2041,7 @@
           <w:sz w:val="28"/>
           <w:szCs w:val="28"/>
         </w:rPr>
-        <w:t>Parvej</w:t>
-      </w:r>
-      <w:proofErr w:type="spellEnd"/>
-      <w:r>
-        <w:rPr>
-          <w:rFonts w:ascii="Times New Roman" w:hAnsi="Times New Roman" w:cs="Times New Roman"/>
-          <w:b/>
-          <w:sz w:val="28"/>
-          <w:szCs w:val="28"/>
-        </w:rPr>
-        <w:t xml:space="preserve"> Khan (EN22CS301697)</w:t>
+        <w:t>Parvej Khan (EN22CS301697)</w:t>
       </w:r>
     </w:p>
     <w:p>
@@ -2075,27 +2062,7 @@
           <w:sz w:val="28"/>
           <w:szCs w:val="28"/>
         </w:rPr>
-        <w:t xml:space="preserve">Sagar </w:t>
-      </w:r>
-      <w:proofErr w:type="spellStart"/>
-      <w:r>
-        <w:rPr>
-          <w:rFonts w:ascii="Times New Roman" w:hAnsi="Times New Roman" w:cs="Times New Roman"/>
-          <w:b/>
-          <w:sz w:val="28"/>
-          <w:szCs w:val="28"/>
-        </w:rPr>
-        <w:t>Hedav</w:t>
-      </w:r>
-      <w:proofErr w:type="spellEnd"/>
-      <w:r>
-        <w:rPr>
-          <w:rFonts w:ascii="Times New Roman" w:hAnsi="Times New Roman" w:cs="Times New Roman"/>
-          <w:b/>
-          <w:sz w:val="28"/>
-          <w:szCs w:val="28"/>
-        </w:rPr>
-        <w:t xml:space="preserve"> (EN22CS301837)</w:t>
+        <w:t>Sagar Hedav (EN22CS301837)</w:t>
       </w:r>
     </w:p>
     <w:p>
@@ -2228,7 +2195,7 @@
           <w:sz w:val="28"/>
           <w:szCs w:val="28"/>
         </w:rPr>
-        <w:t xml:space="preserve">Ajeet Singh Rajput, Shyam Patel, </w:t>
+        <w:t xml:space="preserve">Prof. </w:t>
       </w:r>
       <w:r>
         <w:rPr>
@@ -2238,6 +2205,36 @@
           <w:sz w:val="28"/>
           <w:szCs w:val="28"/>
         </w:rPr>
+        <w:t xml:space="preserve">Ajeet Singh Rajput, </w:t>
+      </w:r>
+      <w:r>
+        <w:rPr>
+          <w:rFonts w:ascii="Times New Roman" w:hAnsi="Times New Roman" w:cs="Times New Roman"/>
+          <w:b/>
+          <w:bCs/>
+          <w:sz w:val="28"/>
+          <w:szCs w:val="28"/>
+        </w:rPr>
+        <w:t xml:space="preserve">Prof. </w:t>
+      </w:r>
+      <w:r>
+        <w:rPr>
+          <w:rFonts w:ascii="Times New Roman" w:hAnsi="Times New Roman" w:cs="Times New Roman"/>
+          <w:b/>
+          <w:bCs/>
+          <w:sz w:val="28"/>
+          <w:szCs w:val="28"/>
+        </w:rPr>
+        <w:t xml:space="preserve">Shyam Patel, </w:t>
+      </w:r>
+      <w:r>
+        <w:rPr>
+          <w:rFonts w:ascii="Times New Roman" w:hAnsi="Times New Roman" w:cs="Times New Roman"/>
+          <w:b/>
+          <w:bCs/>
+          <w:sz w:val="28"/>
+          <w:szCs w:val="28"/>
+        </w:rPr>
         <w:t>Dr. Hemlata Patel</w:t>
       </w:r>
       <w:r>
@@ -2308,51 +2305,7 @@
           <w:sz w:val="28"/>
           <w:szCs w:val="28"/>
         </w:rPr>
-        <w:t xml:space="preserve">Rohan Singh Rajput, Payal Tiwari, Sagar </w:t>
-      </w:r>
-      <w:proofErr w:type="spellStart"/>
-      <w:r>
-        <w:rPr>
-          <w:rFonts w:ascii="Times New Roman" w:hAnsi="Times New Roman" w:cs="Times New Roman"/>
-          <w:b/>
-          <w:bCs/>
-          <w:sz w:val="28"/>
-          <w:szCs w:val="28"/>
-        </w:rPr>
-        <w:t>Hedav</w:t>
-      </w:r>
-      <w:proofErr w:type="spellEnd"/>
-      <w:r>
-        <w:rPr>
-          <w:rFonts w:ascii="Times New Roman" w:hAnsi="Times New Roman" w:cs="Times New Roman"/>
-          <w:b/>
-          <w:bCs/>
-          <w:sz w:val="28"/>
-          <w:szCs w:val="28"/>
-        </w:rPr>
-        <w:t xml:space="preserve">, </w:t>
-      </w:r>
-      <w:proofErr w:type="spellStart"/>
-      <w:r>
-        <w:rPr>
-          <w:rFonts w:ascii="Times New Roman" w:hAnsi="Times New Roman" w:cs="Times New Roman"/>
-          <w:b/>
-          <w:bCs/>
-          <w:sz w:val="28"/>
-          <w:szCs w:val="28"/>
-        </w:rPr>
-        <w:t>Parvej</w:t>
-      </w:r>
-      <w:proofErr w:type="spellEnd"/>
-      <w:r>
-        <w:rPr>
-          <w:rFonts w:ascii="Times New Roman" w:hAnsi="Times New Roman" w:cs="Times New Roman"/>
-          <w:b/>
-          <w:bCs/>
-          <w:sz w:val="28"/>
-          <w:szCs w:val="28"/>
-        </w:rPr>
-        <w:t xml:space="preserve"> Khan, Prayag Holkar</w:t>
+        <w:t>Rohan Singh Rajput, Payal Tiwari, Sagar Hedav, Parvej Khan, Prayag Holkar</w:t>
       </w:r>
       <w:r>
         <w:rPr>
@@ -3154,23 +3107,7 @@
           <w:rFonts w:ascii="Times New Roman" w:hAnsi="Times New Roman" w:cs="Times New Roman"/>
           <w:sz w:val="24"/>
         </w:rPr>
-        <w:t xml:space="preserve">IBM </w:t>
-      </w:r>
-      <w:proofErr w:type="spellStart"/>
-      <w:r>
-        <w:rPr>
-          <w:rFonts w:ascii="Times New Roman" w:hAnsi="Times New Roman" w:cs="Times New Roman"/>
-          <w:sz w:val="24"/>
-        </w:rPr>
-        <w:t>Datagami</w:t>
-      </w:r>
-      <w:proofErr w:type="spellEnd"/>
-      <w:r>
-        <w:rPr>
-          <w:rFonts w:ascii="Times New Roman" w:hAnsi="Times New Roman" w:cs="Times New Roman"/>
-          <w:sz w:val="24"/>
-        </w:rPr>
-        <w:t xml:space="preserve"> </w:t>
+        <w:t xml:space="preserve">IBM Datagami </w:t>
       </w:r>
       <w:r>
         <w:rPr>
@@ -3186,7 +3123,34 @@
           <w:bCs/>
           <w:sz w:val="24"/>
         </w:rPr>
-        <w:t xml:space="preserve">Ajeet Singh Rajput, Shyam Patel, </w:t>
+        <w:t xml:space="preserve">Prof. </w:t>
+      </w:r>
+      <w:r>
+        <w:rPr>
+          <w:rFonts w:ascii="Times New Roman" w:hAnsi="Times New Roman" w:cs="Times New Roman"/>
+          <w:b/>
+          <w:bCs/>
+          <w:sz w:val="24"/>
+        </w:rPr>
+        <w:t xml:space="preserve">Ajeet Singh Rajput, </w:t>
+      </w:r>
+      <w:r>
+        <w:rPr>
+          <w:rFonts w:ascii="Times New Roman" w:hAnsi="Times New Roman" w:cs="Times New Roman"/>
+          <w:b/>
+          <w:bCs/>
+          <w:sz w:val="24"/>
+        </w:rPr>
+        <w:t xml:space="preserve">Prof. </w:t>
+      </w:r>
+      <w:r>
+        <w:rPr>
+          <w:rFonts w:ascii="Times New Roman" w:hAnsi="Times New Roman" w:cs="Times New Roman"/>
+          <w:b/>
+          <w:bCs/>
+          <w:sz w:val="24"/>
+        </w:rPr>
+        <w:t xml:space="preserve">Shyam Patel, </w:t>
       </w:r>
       <w:r>
         <w:rPr>
@@ -3417,19 +3381,8 @@
           <w:sz w:val="24"/>
           <w:szCs w:val="24"/>
         </w:rPr>
-        <w:t xml:space="preserve">Sagar </w:t>
-      </w:r>
-      <w:proofErr w:type="spellStart"/>
-      <w:r>
-        <w:rPr>
-          <w:rFonts w:ascii="Times New Roman" w:hAnsi="Times New Roman" w:cs="Times New Roman"/>
-          <w:b/>
-          <w:sz w:val="24"/>
-          <w:szCs w:val="24"/>
-        </w:rPr>
-        <w:t>Hedav</w:t>
-      </w:r>
-      <w:proofErr w:type="spellEnd"/>
+        <w:t>Sagar Hedav</w:t>
+      </w:r>
     </w:p>
     <w:p>
       <w:pPr>
@@ -3445,7 +3398,6 @@
           <w:szCs w:val="24"/>
         </w:rPr>
       </w:pPr>
-      <w:proofErr w:type="spellStart"/>
       <w:r>
         <w:rPr>
           <w:rFonts w:ascii="Times New Roman" w:hAnsi="Times New Roman" w:cs="Times New Roman"/>
@@ -3453,17 +3405,7 @@
           <w:sz w:val="24"/>
           <w:szCs w:val="24"/>
         </w:rPr>
-        <w:t>Parvej</w:t>
-      </w:r>
-      <w:proofErr w:type="spellEnd"/>
-      <w:r>
-        <w:rPr>
-          <w:rFonts w:ascii="Times New Roman" w:hAnsi="Times New Roman" w:cs="Times New Roman"/>
-          <w:b/>
-          <w:sz w:val="24"/>
-          <w:szCs w:val="24"/>
-        </w:rPr>
-        <w:t xml:space="preserve"> Khan</w:t>
+        <w:t>Parvej Khan</w:t>
       </w:r>
     </w:p>
     <w:p>
@@ -3577,7 +3519,6 @@
           <w:szCs w:val="28"/>
         </w:rPr>
       </w:pPr>
-      <w:proofErr w:type="spellStart"/>
       <w:r>
         <w:rPr>
           <w:rFonts w:ascii="Times New Roman" w:hAnsi="Times New Roman" w:cs="Times New Roman"/>
@@ -3586,7 +3527,6 @@
         </w:rPr>
         <w:t>Medicaps</w:t>
       </w:r>
-      <w:proofErr w:type="spellEnd"/>
       <w:r>
         <w:rPr>
           <w:rFonts w:ascii="Times New Roman" w:hAnsi="Times New Roman" w:cs="Times New Roman"/>
@@ -3721,7 +3661,6 @@
         </w:rPr>
         <w:t>Traditional staff training methodologies within non-profit organizations often rely on static documentation, leading to poor retention and inconsistent application of donor communication policies. While Large Language Models (LLMs) offer interactive training solutions, their tendency to hallucinate and generate generic advice poses significant compliance risks when dealing with sensitive donor relations. This project presents the "</w:t>
       </w:r>
-      <w:proofErr w:type="spellStart"/>
       <w:proofErr w:type="gramStart"/>
       <w:r>
         <w:rPr>
@@ -3732,7 +3671,6 @@
         </w:rPr>
         <w:t>Non Profit</w:t>
       </w:r>
-      <w:proofErr w:type="spellEnd"/>
       <w:proofErr w:type="gramEnd"/>
       <w:r>
         <w:rPr>
@@ -3764,107 +3702,7 @@
           <w:sz w:val="24"/>
           <w:lang w:val="en-IN"/>
         </w:rPr>
-        <w:t xml:space="preserve">The system leverages a decoupled Microservices architecture, integrating a </w:t>
-      </w:r>
-      <w:proofErr w:type="spellStart"/>
-      <w:r>
-        <w:rPr>
-          <w:rFonts w:ascii="Times New Roman" w:hAnsi="Times New Roman" w:cs="Times New Roman"/>
-          <w:bCs/>
-          <w:sz w:val="24"/>
-          <w:lang w:val="en-IN"/>
-        </w:rPr>
-        <w:t>FastAPI</w:t>
-      </w:r>
-      <w:proofErr w:type="spellEnd"/>
-      <w:r>
-        <w:rPr>
-          <w:rFonts w:ascii="Times New Roman" w:hAnsi="Times New Roman" w:cs="Times New Roman"/>
-          <w:bCs/>
-          <w:sz w:val="24"/>
-          <w:lang w:val="en-IN"/>
-        </w:rPr>
-        <w:t xml:space="preserve"> backend with a </w:t>
-      </w:r>
-      <w:proofErr w:type="spellStart"/>
-      <w:r>
-        <w:rPr>
-          <w:rFonts w:ascii="Times New Roman" w:hAnsi="Times New Roman" w:cs="Times New Roman"/>
-          <w:bCs/>
-          <w:sz w:val="24"/>
-          <w:lang w:val="en-IN"/>
-        </w:rPr>
-        <w:t>Streamlit</w:t>
-      </w:r>
-      <w:proofErr w:type="spellEnd"/>
-      <w:r>
-        <w:rPr>
-          <w:rFonts w:ascii="Times New Roman" w:hAnsi="Times New Roman" w:cs="Times New Roman"/>
-          <w:bCs/>
-          <w:sz w:val="24"/>
-          <w:lang w:val="en-IN"/>
-        </w:rPr>
-        <w:t xml:space="preserve"> frontend to ensure high availability and separation of concerns. To eliminate AI hallucinations, the platform implements a local Retrieval-Augmented Generation (RAG) pipeline utilizing </w:t>
-      </w:r>
-      <w:proofErr w:type="spellStart"/>
-      <w:r>
-        <w:rPr>
-          <w:rFonts w:ascii="Times New Roman" w:hAnsi="Times New Roman" w:cs="Times New Roman"/>
-          <w:bCs/>
-          <w:sz w:val="24"/>
-          <w:lang w:val="en-IN"/>
-        </w:rPr>
-        <w:t>ChromaDB</w:t>
-      </w:r>
-      <w:proofErr w:type="spellEnd"/>
-      <w:r>
-        <w:rPr>
-          <w:rFonts w:ascii="Times New Roman" w:hAnsi="Times New Roman" w:cs="Times New Roman"/>
-          <w:bCs/>
-          <w:sz w:val="24"/>
-          <w:lang w:val="en-IN"/>
-        </w:rPr>
-        <w:t xml:space="preserve"> and </w:t>
-      </w:r>
-      <w:proofErr w:type="spellStart"/>
-      <w:r>
-        <w:rPr>
-          <w:rFonts w:ascii="Times New Roman" w:hAnsi="Times New Roman" w:cs="Times New Roman"/>
-          <w:bCs/>
-          <w:sz w:val="24"/>
-          <w:lang w:val="en-IN"/>
-        </w:rPr>
-        <w:t>LangChain</w:t>
-      </w:r>
-      <w:proofErr w:type="spellEnd"/>
-      <w:r>
-        <w:rPr>
-          <w:rFonts w:ascii="Times New Roman" w:hAnsi="Times New Roman" w:cs="Times New Roman"/>
-          <w:bCs/>
-          <w:sz w:val="24"/>
-          <w:lang w:val="en-IN"/>
-        </w:rPr>
-        <w:t xml:space="preserve">, effectively constraining the generative model (Google Gemini 2.5 Flash) to strictly adhere to the organization's private policy documents. Furthermore, the system introduces an Agentic Triage workflow capable of autonomously </w:t>
-      </w:r>
-      <w:proofErr w:type="spellStart"/>
-      <w:r>
-        <w:rPr>
-          <w:rFonts w:ascii="Times New Roman" w:hAnsi="Times New Roman" w:cs="Times New Roman"/>
-          <w:bCs/>
-          <w:sz w:val="24"/>
-          <w:lang w:val="en-IN"/>
-        </w:rPr>
-        <w:t>analyzing</w:t>
-      </w:r>
-      <w:proofErr w:type="spellEnd"/>
-      <w:r>
-        <w:rPr>
-          <w:rFonts w:ascii="Times New Roman" w:hAnsi="Times New Roman" w:cs="Times New Roman"/>
-          <w:bCs/>
-          <w:sz w:val="24"/>
-          <w:lang w:val="en-IN"/>
-        </w:rPr>
-        <w:t xml:space="preserve"> incoming communications, calculating urgency metrics, and generating specific Service Level Agreements (SLAs) and Action Plans before automatically synthesizing customized multiple-choice training quizzes. Finally, the entire application stack is containerized using Docker and integrated into a Continuous Integration/Continuous Deployment (CI/CD) pipeline via GitHub Actions, establishing a scalable, cloud-ready DevOps infrastructure. The resulting system successfully bridges the gap between static compliance manuals and dynamic, context-aware AI training.</w:t>
+        <w:t>The system leverages a decoupled Microservices architecture, integrating a FastAPI backend with a Streamlit frontend to ensure high availability and separation of concerns. To eliminate AI hallucinations, the platform implements a local Retrieval-Augmented Generation (RAG) pipeline utilizing ChromaDB and LangChain, effectively constraining the generative model (Google Gemini 2.5 Flash) to strictly adhere to the organization's private policy documents. Furthermore, the system introduces an Agentic Triage workflow capable of autonomously analyzing incoming communications, calculating urgency metrics, and generating specific Service Level Agreements (SLAs) and Action Plans before automatically synthesizing customized multiple-choice training quizzes. Finally, the entire application stack is containerized using Docker and integrated into a Continuous Integration/Continuous Deployment (CI/CD) pipeline via GitHub Actions, establishing a scalable, cloud-ready DevOps infrastructure. The resulting system successfully bridges the gap between static compliance manuals and dynamic, context-aware AI training.</w:t>
       </w:r>
     </w:p>
     <w:p>
@@ -4087,7 +3925,6 @@
           <w:szCs w:val="24"/>
         </w:rPr>
       </w:pPr>
-      <w:proofErr w:type="spellStart"/>
       <w:r>
         <w:rPr>
           <w:rFonts w:ascii="Times New Roman" w:hAnsi="Times New Roman" w:cs="Times New Roman"/>
@@ -4097,7 +3934,6 @@
         </w:rPr>
         <w:t>FastAPI</w:t>
       </w:r>
-      <w:proofErr w:type="spellEnd"/>
     </w:p>
     <w:p>
       <w:pPr>
@@ -8252,25 +8088,7 @@
                 <w:sz w:val="28"/>
                 <w:szCs w:val="28"/>
               </w:rPr>
-              <w:t xml:space="preserve">4.3 </w:t>
-            </w:r>
-            <w:proofErr w:type="spellStart"/>
-            <w:r>
-              <w:rPr>
-                <w:rFonts w:ascii="Times New Roman" w:eastAsia="Times New Roman" w:hAnsi="Times New Roman" w:cs="Times New Roman"/>
-                <w:sz w:val="28"/>
-                <w:szCs w:val="28"/>
-              </w:rPr>
-              <w:t>Devops</w:t>
-            </w:r>
-            <w:proofErr w:type="spellEnd"/>
-            <w:r>
-              <w:rPr>
-                <w:rFonts w:ascii="Times New Roman" w:eastAsia="Times New Roman" w:hAnsi="Times New Roman" w:cs="Times New Roman"/>
-                <w:sz w:val="28"/>
-                <w:szCs w:val="28"/>
-              </w:rPr>
-              <w:t xml:space="preserve"> Implementation</w:t>
+              <w:t>4.3 Devops Implementation</w:t>
             </w:r>
           </w:p>
         </w:tc>
@@ -10058,7 +9876,6 @@
                 <w:szCs w:val="32"/>
               </w:rPr>
             </w:pPr>
-            <w:proofErr w:type="spellStart"/>
             <w:r>
               <w:rPr>
                 <w:rFonts w:ascii="Times New Roman" w:hAnsi="Times New Roman" w:cs="Times New Roman"/>
@@ -10069,7 +9886,6 @@
               </w:rPr>
               <w:t>Fig.No</w:t>
             </w:r>
-            <w:proofErr w:type="spellEnd"/>
           </w:p>
         </w:tc>
         <w:tc>
@@ -11706,27 +11522,7 @@
           <w:szCs w:val="24"/>
           <w:lang w:val="en-IN"/>
         </w:rPr>
-        <w:t xml:space="preserve"> YAML </w:t>
-      </w:r>
-      <w:proofErr w:type="spellStart"/>
-      <w:r>
-        <w:rPr>
-          <w:rFonts w:ascii="Times New Roman" w:hAnsi="Times New Roman" w:cs="Times New Roman"/>
-          <w:sz w:val="24"/>
-          <w:szCs w:val="24"/>
-          <w:lang w:val="en-IN"/>
-        </w:rPr>
-        <w:t>Ain't</w:t>
-      </w:r>
-      <w:proofErr w:type="spellEnd"/>
-      <w:r>
-        <w:rPr>
-          <w:rFonts w:ascii="Times New Roman" w:hAnsi="Times New Roman" w:cs="Times New Roman"/>
-          <w:sz w:val="24"/>
-          <w:szCs w:val="24"/>
-          <w:lang w:val="en-IN"/>
-        </w:rPr>
-        <w:t xml:space="preserve"> Markup Language</w:t>
+        <w:t> YAML Ain't Markup Language</w:t>
       </w:r>
     </w:p>
     <w:p>
@@ -11945,7 +11741,6 @@
           <w:lang w:val="en-IN"/>
         </w:rPr>
       </w:pPr>
-      <w:proofErr w:type="spellStart"/>
       <w:r>
         <w:rPr>
           <w:rFonts w:ascii="Times New Roman" w:hAnsi="Times New Roman" w:cs="Times New Roman"/>
@@ -11969,7 +11764,6 @@
         </w:rPr>
         <w:t>i</w:t>
       </w:r>
-      <w:proofErr w:type="spellEnd"/>
       <w:r>
         <w:rPr>
           <w:rFonts w:ascii="Times New Roman" w:hAnsi="Times New Roman" w:cs="Times New Roman"/>
@@ -12096,27 +11890,7 @@
           <w:szCs w:val="24"/>
           <w:lang w:val="en-IN"/>
         </w:rPr>
-        <w:t xml:space="preserve"> The Vector Space (</w:t>
-      </w:r>
-      <w:proofErr w:type="spellStart"/>
-      <w:r>
-        <w:rPr>
-          <w:rFonts w:ascii="Times New Roman" w:hAnsi="Times New Roman" w:cs="Times New Roman"/>
-          <w:sz w:val="24"/>
-          <w:szCs w:val="24"/>
-          <w:lang w:val="en-IN"/>
-        </w:rPr>
-        <w:t>ChromaDB</w:t>
-      </w:r>
-      <w:proofErr w:type="spellEnd"/>
-      <w:r>
-        <w:rPr>
-          <w:rFonts w:ascii="Times New Roman" w:hAnsi="Times New Roman" w:cs="Times New Roman"/>
-          <w:sz w:val="24"/>
-          <w:szCs w:val="24"/>
-          <w:lang w:val="en-IN"/>
-        </w:rPr>
-        <w:t>) containing the embedded documents $E(D)$.</w:t>
+        <w:t xml:space="preserve"> The Vector Space (ChromaDB) containing the embedded documents $E(D)$.</w:t>
       </w:r>
     </w:p>
     <w:p>
@@ -12646,7 +12420,6 @@
         </w:rPr>
         <w:t>Effective communication with donors is the lifeblood of any non-profit organization. However, training new staff to handle complex, sensitive, or high-stakes donor interactions is often a slow and resource-intensive process. Traditional training relies heavily on static handbooks and hypothetical roleplaying, which fail to scale effectively. The advent of Large Language Models (LLMs) presents an opportunity to automate this training through interactive AI scenarios. This project introduces the "</w:t>
       </w:r>
-      <w:proofErr w:type="spellStart"/>
       <w:proofErr w:type="gramStart"/>
       <w:r>
         <w:rPr>
@@ -12656,7 +12429,6 @@
         </w:rPr>
         <w:t>Non Profit</w:t>
       </w:r>
-      <w:proofErr w:type="spellEnd"/>
       <w:proofErr w:type="gramEnd"/>
       <w:r>
         <w:rPr>
@@ -12821,27 +12593,7 @@
           <w:szCs w:val="24"/>
           <w:lang w:val="en-IN"/>
         </w:rPr>
-        <w:t xml:space="preserve">Develop an Agentic Triage System: Create an AI router capable of </w:t>
-      </w:r>
-      <w:proofErr w:type="spellStart"/>
-      <w:r>
-        <w:rPr>
-          <w:rFonts w:ascii="Times New Roman" w:hAnsi="Times New Roman" w:cs="Times New Roman"/>
-          <w:sz w:val="24"/>
-          <w:szCs w:val="24"/>
-          <w:lang w:val="en-IN"/>
-        </w:rPr>
-        <w:t>analyzing</w:t>
-      </w:r>
-      <w:proofErr w:type="spellEnd"/>
-      <w:r>
-        <w:rPr>
-          <w:rFonts w:ascii="Times New Roman" w:hAnsi="Times New Roman" w:cs="Times New Roman"/>
-          <w:sz w:val="24"/>
-          <w:szCs w:val="24"/>
-          <w:lang w:val="en-IN"/>
-        </w:rPr>
-        <w:t xml:space="preserve"> raw donor emails to calculate urgency and assign Service Level Agreements (SLAs).</w:t>
+        <w:t>Develop an Agentic Triage System: Create an AI router capable of analyzing raw donor emails to calculate urgency and assign Service Level Agreements (SLAs).</w:t>
       </w:r>
     </w:p>
     <w:p>
@@ -12868,47 +12620,7 @@
           <w:szCs w:val="24"/>
           <w:lang w:val="en-IN"/>
         </w:rPr>
-        <w:t xml:space="preserve">Implement strict RAG Compliance: Utilize </w:t>
-      </w:r>
-      <w:proofErr w:type="spellStart"/>
-      <w:r>
-        <w:rPr>
-          <w:rFonts w:ascii="Times New Roman" w:hAnsi="Times New Roman" w:cs="Times New Roman"/>
-          <w:sz w:val="24"/>
-          <w:szCs w:val="24"/>
-          <w:lang w:val="en-IN"/>
-        </w:rPr>
-        <w:t>ChromaDB</w:t>
-      </w:r>
-      <w:proofErr w:type="spellEnd"/>
-      <w:r>
-        <w:rPr>
-          <w:rFonts w:ascii="Times New Roman" w:hAnsi="Times New Roman" w:cs="Times New Roman"/>
-          <w:sz w:val="24"/>
-          <w:szCs w:val="24"/>
-          <w:lang w:val="en-IN"/>
-        </w:rPr>
-        <w:t xml:space="preserve"> and </w:t>
-      </w:r>
-      <w:proofErr w:type="spellStart"/>
-      <w:r>
-        <w:rPr>
-          <w:rFonts w:ascii="Times New Roman" w:hAnsi="Times New Roman" w:cs="Times New Roman"/>
-          <w:sz w:val="24"/>
-          <w:szCs w:val="24"/>
-          <w:lang w:val="en-IN"/>
-        </w:rPr>
-        <w:t>LangChain</w:t>
-      </w:r>
-      <w:proofErr w:type="spellEnd"/>
-      <w:r>
-        <w:rPr>
-          <w:rFonts w:ascii="Times New Roman" w:hAnsi="Times New Roman" w:cs="Times New Roman"/>
-          <w:sz w:val="24"/>
-          <w:szCs w:val="24"/>
-          <w:lang w:val="en-IN"/>
-        </w:rPr>
-        <w:t xml:space="preserve"> to mathematically anchor the generative AI (Gemini 2.5 Flash) to the organization's specific PDF rulebooks, eliminating hallucinations.</w:t>
+        <w:t>Implement strict RAG Compliance: Utilize ChromaDB and LangChain to mathematically anchor the generative AI (Gemini 2.5 Flash) to the organization's specific PDF rulebooks, eliminating hallucinations.</w:t>
       </w:r>
     </w:p>
     <w:p>
@@ -13078,61 +12790,7 @@
           <w:sz w:val="24"/>
           <w:szCs w:val="24"/>
         </w:rPr>
-        <w:t>This project utilizes a systems engineering approach, focusing on a decoupled Microservices architecture. The system is divided into a stateless Presentation Layer (</w:t>
-      </w:r>
-      <w:proofErr w:type="spellStart"/>
-      <w:r>
-        <w:rPr>
-          <w:rFonts w:ascii="Times New Roman" w:hAnsi="Times New Roman" w:cs="Times New Roman"/>
-          <w:sz w:val="24"/>
-          <w:szCs w:val="24"/>
-        </w:rPr>
-        <w:t>Streamlit</w:t>
-      </w:r>
-      <w:proofErr w:type="spellEnd"/>
-      <w:r>
-        <w:rPr>
-          <w:rFonts w:ascii="Times New Roman" w:hAnsi="Times New Roman" w:cs="Times New Roman"/>
-          <w:sz w:val="24"/>
-          <w:szCs w:val="24"/>
-        </w:rPr>
-        <w:t>) and a Service Layer (</w:t>
-      </w:r>
-      <w:proofErr w:type="spellStart"/>
-      <w:r>
-        <w:rPr>
-          <w:rFonts w:ascii="Times New Roman" w:hAnsi="Times New Roman" w:cs="Times New Roman"/>
-          <w:sz w:val="24"/>
-          <w:szCs w:val="24"/>
-        </w:rPr>
-        <w:t>FastAPI</w:t>
-      </w:r>
-      <w:proofErr w:type="spellEnd"/>
-      <w:r>
-        <w:rPr>
-          <w:rFonts w:ascii="Times New Roman" w:hAnsi="Times New Roman" w:cs="Times New Roman"/>
-          <w:sz w:val="24"/>
-          <w:szCs w:val="24"/>
-        </w:rPr>
-        <w:t xml:space="preserve">). The core reasoning engine utilizes prompt engineering to construct an Agentic workflow, while the knowledge layer relies on high-dimensional vector embeddings stored in a local SQLite-based </w:t>
-      </w:r>
-      <w:proofErr w:type="spellStart"/>
-      <w:r>
-        <w:rPr>
-          <w:rFonts w:ascii="Times New Roman" w:hAnsi="Times New Roman" w:cs="Times New Roman"/>
-          <w:sz w:val="24"/>
-          <w:szCs w:val="24"/>
-        </w:rPr>
-        <w:t>ChromaDB</w:t>
-      </w:r>
-      <w:proofErr w:type="spellEnd"/>
-      <w:r>
-        <w:rPr>
-          <w:rFonts w:ascii="Times New Roman" w:hAnsi="Times New Roman" w:cs="Times New Roman"/>
-          <w:sz w:val="24"/>
-          <w:szCs w:val="24"/>
-        </w:rPr>
-        <w:t xml:space="preserve"> instance. The design prioritizes modularity, allowing the underlying language model or the vector database to be swapped out without disrupting the user interface.</w:t>
+        <w:t>This project utilizes a systems engineering approach, focusing on a decoupled Microservices architecture. The system is divided into a stateless Presentation Layer (Streamlit) and a Service Layer (FastAPI). The core reasoning engine utilizes prompt engineering to construct an Agentic workflow, while the knowledge layer relies on high-dimensional vector embeddings stored in a local SQLite-based ChromaDB instance. The design prioritizes modularity, allowing the underlying language model or the vector database to be swapped out without disrupting the user interface.</w:t>
       </w:r>
     </w:p>
     <w:p>
@@ -13354,43 +13012,7 @@
           <w:sz w:val="24"/>
           <w:szCs w:val="24"/>
         </w:rPr>
-        <w:t> details the system architecture and technologies, focusing on the decoupled Microservices approach, the specific technology stack (</w:t>
-      </w:r>
-      <w:proofErr w:type="spellStart"/>
-      <w:r>
-        <w:rPr>
-          <w:rFonts w:ascii="Times New Roman" w:hAnsi="Times New Roman" w:cs="Times New Roman"/>
-          <w:sz w:val="24"/>
-          <w:szCs w:val="24"/>
-        </w:rPr>
-        <w:t>FastAPI</w:t>
-      </w:r>
-      <w:proofErr w:type="spellEnd"/>
-      <w:r>
-        <w:rPr>
-          <w:rFonts w:ascii="Times New Roman" w:hAnsi="Times New Roman" w:cs="Times New Roman"/>
-          <w:sz w:val="24"/>
-          <w:szCs w:val="24"/>
-        </w:rPr>
-        <w:t xml:space="preserve">, </w:t>
-      </w:r>
-      <w:proofErr w:type="spellStart"/>
-      <w:r>
-        <w:rPr>
-          <w:rFonts w:ascii="Times New Roman" w:hAnsi="Times New Roman" w:cs="Times New Roman"/>
-          <w:sz w:val="24"/>
-          <w:szCs w:val="24"/>
-        </w:rPr>
-        <w:t>Streamlit</w:t>
-      </w:r>
-      <w:proofErr w:type="spellEnd"/>
-      <w:r>
-        <w:rPr>
-          <w:rFonts w:ascii="Times New Roman" w:hAnsi="Times New Roman" w:cs="Times New Roman"/>
-          <w:sz w:val="24"/>
-          <w:szCs w:val="24"/>
-        </w:rPr>
-        <w:t>, Gemini API), and the mathematical foundation of the RAG system. </w:t>
+        <w:t> details the system architecture and technologies, focusing on the decoupled Microservices approach, the specific technology stack (FastAPI, Streamlit, Gemini API), and the mathematical foundation of the RAG system. </w:t>
       </w:r>
       <w:r>
         <w:rPr>
@@ -13558,7 +13180,6 @@
         </w:rPr>
         <w:t>This chapter delineates the precise technical and operational requirements necessary for the successful deployment of the "</w:t>
       </w:r>
-      <w:proofErr w:type="spellStart"/>
       <w:proofErr w:type="gramStart"/>
       <w:r>
         <w:rPr>
@@ -13568,7 +13189,6 @@
         </w:rPr>
         <w:t>Non Profit</w:t>
       </w:r>
-      <w:proofErr w:type="spellEnd"/>
       <w:proofErr w:type="gramEnd"/>
       <w:r>
         <w:rPr>
@@ -13651,27 +13271,7 @@
           <w:szCs w:val="24"/>
           <w:lang w:val="en-IN"/>
         </w:rPr>
-        <w:t xml:space="preserve">The Trainee (Junior Staff): Requires an intuitive, zero-code Graphical User Interface (GUI). They interact purely with the </w:t>
-      </w:r>
-      <w:proofErr w:type="spellStart"/>
-      <w:r>
-        <w:rPr>
-          <w:rFonts w:ascii="Times New Roman" w:hAnsi="Times New Roman" w:cs="Times New Roman"/>
-          <w:sz w:val="24"/>
-          <w:szCs w:val="24"/>
-          <w:lang w:val="en-IN"/>
-        </w:rPr>
-        <w:t>Streamlit</w:t>
-      </w:r>
-      <w:proofErr w:type="spellEnd"/>
-      <w:r>
-        <w:rPr>
-          <w:rFonts w:ascii="Times New Roman" w:hAnsi="Times New Roman" w:cs="Times New Roman"/>
-          <w:sz w:val="24"/>
-          <w:szCs w:val="24"/>
-          <w:lang w:val="en-IN"/>
-        </w:rPr>
-        <w:t xml:space="preserve"> frontend to input scenarios and answer quizzes. No technical expertise is expected.</w:t>
+        <w:t>The Trainee (Junior Staff): Requires an intuitive, zero-code Graphical User Interface (GUI). They interact purely with the Streamlit frontend to input scenarios and answer quizzes. No technical expertise is expected.</w:t>
       </w:r>
     </w:p>
     <w:p>
@@ -14014,25 +13614,7 @@
                 <w:sz w:val="24"/>
                 <w:szCs w:val="24"/>
               </w:rPr>
-              <w:t xml:space="preserve">The backend must extract text from PDF files in the /data directory and embed them into a local </w:t>
-            </w:r>
-            <w:proofErr w:type="spellStart"/>
-            <w:r>
-              <w:rPr>
-                <w:rFonts w:ascii="Times New Roman" w:hAnsi="Times New Roman" w:cs="Times New Roman"/>
-                <w:sz w:val="24"/>
-                <w:szCs w:val="24"/>
-              </w:rPr>
-              <w:t>ChromaDB</w:t>
-            </w:r>
-            <w:proofErr w:type="spellEnd"/>
-            <w:r>
-              <w:rPr>
-                <w:rFonts w:ascii="Times New Roman" w:hAnsi="Times New Roman" w:cs="Times New Roman"/>
-                <w:sz w:val="24"/>
-                <w:szCs w:val="24"/>
-              </w:rPr>
-              <w:t xml:space="preserve"> vector space upon boot.</w:t>
+              <w:t>The backend must extract text from PDF files in the /data directory and embed them into a local ChromaDB vector space upon boot.</w:t>
             </w:r>
           </w:p>
         </w:tc>
@@ -14312,27 +13894,7 @@
           <w:szCs w:val="24"/>
           <w:lang w:val="en-IN"/>
         </w:rPr>
-        <w:t xml:space="preserve"> The </w:t>
-      </w:r>
-      <w:proofErr w:type="spellStart"/>
-      <w:r>
-        <w:rPr>
-          <w:rFonts w:ascii="Times New Roman" w:hAnsi="Times New Roman" w:cs="Times New Roman"/>
-          <w:sz w:val="24"/>
-          <w:szCs w:val="24"/>
-          <w:lang w:val="en-IN"/>
-        </w:rPr>
-        <w:t>FastAPI</w:t>
-      </w:r>
-      <w:proofErr w:type="spellEnd"/>
-      <w:r>
-        <w:rPr>
-          <w:rFonts w:ascii="Times New Roman" w:hAnsi="Times New Roman" w:cs="Times New Roman"/>
-          <w:sz w:val="24"/>
-          <w:szCs w:val="24"/>
-          <w:lang w:val="en-IN"/>
-        </w:rPr>
-        <w:t xml:space="preserve"> routing mechanism must handle HTTP requests asynchronously to ensure the UI does not freeze during heavy LLM generation.</w:t>
+        <w:t> The FastAPI routing mechanism must handle HTTP requests asynchronously to ensure the UI does not freeze during heavy LLM generation.</w:t>
       </w:r>
     </w:p>
     <w:p>
@@ -14370,27 +13932,7 @@
           <w:szCs w:val="24"/>
           <w:lang w:val="en-IN"/>
         </w:rPr>
-        <w:t xml:space="preserve"> Private API keys (GEMINI_API_KEY) must be strictly managed via .env files and never exposed to the frontend </w:t>
-      </w:r>
-      <w:proofErr w:type="spellStart"/>
-      <w:r>
-        <w:rPr>
-          <w:rFonts w:ascii="Times New Roman" w:hAnsi="Times New Roman" w:cs="Times New Roman"/>
-          <w:sz w:val="24"/>
-          <w:szCs w:val="24"/>
-          <w:lang w:val="en-IN"/>
-        </w:rPr>
-        <w:t>Streamlit</w:t>
-      </w:r>
-      <w:proofErr w:type="spellEnd"/>
-      <w:r>
-        <w:rPr>
-          <w:rFonts w:ascii="Times New Roman" w:hAnsi="Times New Roman" w:cs="Times New Roman"/>
-          <w:sz w:val="24"/>
-          <w:szCs w:val="24"/>
-          <w:lang w:val="en-IN"/>
-        </w:rPr>
-        <w:t xml:space="preserve"> instance or stored in version control.</w:t>
+        <w:t> Private API keys (GEMINI_API_KEY) must be strictly managed via .env files and never exposed to the frontend Streamlit instance or stored in version control.</w:t>
       </w:r>
     </w:p>
     <w:p>
@@ -14760,88 +14302,14 @@
                 <w:szCs w:val="24"/>
               </w:rPr>
             </w:pPr>
-            <w:proofErr w:type="spellStart"/>
             <w:r>
               <w:rPr>
                 <w:rFonts w:ascii="Times New Roman" w:hAnsi="Times New Roman" w:cs="Times New Roman"/>
                 <w:sz w:val="24"/>
                 <w:szCs w:val="24"/>
               </w:rPr>
-              <w:t>fastapi</w:t>
+              <w:t>fastapi, streamlit, google-genai, chromadb, langchain</w:t>
             </w:r>
-            <w:proofErr w:type="spellEnd"/>
-            <w:r>
-              <w:rPr>
-                <w:rFonts w:ascii="Times New Roman" w:hAnsi="Times New Roman" w:cs="Times New Roman"/>
-                <w:sz w:val="24"/>
-                <w:szCs w:val="24"/>
-              </w:rPr>
-              <w:t>, </w:t>
-            </w:r>
-            <w:proofErr w:type="spellStart"/>
-            <w:r>
-              <w:rPr>
-                <w:rFonts w:ascii="Times New Roman" w:hAnsi="Times New Roman" w:cs="Times New Roman"/>
-                <w:sz w:val="24"/>
-                <w:szCs w:val="24"/>
-              </w:rPr>
-              <w:t>streamlit</w:t>
-            </w:r>
-            <w:proofErr w:type="spellEnd"/>
-            <w:r>
-              <w:rPr>
-                <w:rFonts w:ascii="Times New Roman" w:hAnsi="Times New Roman" w:cs="Times New Roman"/>
-                <w:sz w:val="24"/>
-                <w:szCs w:val="24"/>
-              </w:rPr>
-              <w:t>, google-</w:t>
-            </w:r>
-            <w:proofErr w:type="spellStart"/>
-            <w:r>
-              <w:rPr>
-                <w:rFonts w:ascii="Times New Roman" w:hAnsi="Times New Roman" w:cs="Times New Roman"/>
-                <w:sz w:val="24"/>
-                <w:szCs w:val="24"/>
-              </w:rPr>
-              <w:t>genai</w:t>
-            </w:r>
-            <w:proofErr w:type="spellEnd"/>
-            <w:r>
-              <w:rPr>
-                <w:rFonts w:ascii="Times New Roman" w:hAnsi="Times New Roman" w:cs="Times New Roman"/>
-                <w:sz w:val="24"/>
-                <w:szCs w:val="24"/>
-              </w:rPr>
-              <w:t>, </w:t>
-            </w:r>
-            <w:proofErr w:type="spellStart"/>
-            <w:r>
-              <w:rPr>
-                <w:rFonts w:ascii="Times New Roman" w:hAnsi="Times New Roman" w:cs="Times New Roman"/>
-                <w:sz w:val="24"/>
-                <w:szCs w:val="24"/>
-              </w:rPr>
-              <w:t>chromadb</w:t>
-            </w:r>
-            <w:proofErr w:type="spellEnd"/>
-            <w:r>
-              <w:rPr>
-                <w:rFonts w:ascii="Times New Roman" w:hAnsi="Times New Roman" w:cs="Times New Roman"/>
-                <w:sz w:val="24"/>
-                <w:szCs w:val="24"/>
-              </w:rPr>
-              <w:t>, </w:t>
-            </w:r>
-            <w:proofErr w:type="spellStart"/>
-            <w:r>
-              <w:rPr>
-                <w:rFonts w:ascii="Times New Roman" w:hAnsi="Times New Roman" w:cs="Times New Roman"/>
-                <w:sz w:val="24"/>
-                <w:szCs w:val="24"/>
-              </w:rPr>
-              <w:t>langchain</w:t>
-            </w:r>
-            <w:proofErr w:type="spellEnd"/>
           </w:p>
         </w:tc>
       </w:tr>
@@ -15013,27 +14481,7 @@
           <w:szCs w:val="24"/>
           <w:lang w:val="en-IN"/>
         </w:rPr>
-        <w:t xml:space="preserve">Local Storage: Because </w:t>
-      </w:r>
-      <w:proofErr w:type="spellStart"/>
-      <w:r>
-        <w:rPr>
-          <w:rFonts w:ascii="Times New Roman" w:hAnsi="Times New Roman" w:cs="Times New Roman"/>
-          <w:sz w:val="24"/>
-          <w:szCs w:val="24"/>
-          <w:lang w:val="en-IN"/>
-        </w:rPr>
-        <w:t>ChromaDB</w:t>
-      </w:r>
-      <w:proofErr w:type="spellEnd"/>
-      <w:r>
-        <w:rPr>
-          <w:rFonts w:ascii="Times New Roman" w:hAnsi="Times New Roman" w:cs="Times New Roman"/>
-          <w:sz w:val="24"/>
-          <w:szCs w:val="24"/>
-          <w:lang w:val="en-IN"/>
-        </w:rPr>
-        <w:t xml:space="preserve"> is running a Persistent SQLite client locally, the server must have adequate disk write permissions and space to permanently store the mathematical embeddings.</w:t>
+        <w:t>Local Storage: Because ChromaDB is running a Persistent SQLite client locally, the server must have adequate disk write permissions and space to permanently store the mathematical embeddings.</w:t>
       </w:r>
     </w:p>
     <w:p>
@@ -15241,7 +14689,6 @@
         </w:rPr>
         <w:t>This chapter translates the requirement specifications established in Chapter 2 into actionable, programmatic architecture. It outlines the structural design of the "</w:t>
       </w:r>
-      <w:proofErr w:type="spellStart"/>
       <w:proofErr w:type="gramStart"/>
       <w:r>
         <w:rPr>
@@ -15251,7 +14698,6 @@
         </w:rPr>
         <w:t>Non Profit</w:t>
       </w:r>
-      <w:proofErr w:type="spellEnd"/>
       <w:proofErr w:type="gramEnd"/>
       <w:r>
         <w:rPr>
@@ -15480,7 +14926,6 @@
                 <w:szCs w:val="28"/>
               </w:rPr>
             </w:pPr>
-            <w:proofErr w:type="spellStart"/>
             <w:r>
               <w:rPr>
                 <w:rFonts w:ascii="Times New Roman" w:hAnsi="Times New Roman" w:cs="Times New Roman"/>
@@ -15489,7 +14934,6 @@
               </w:rPr>
               <w:t>Streamlit</w:t>
             </w:r>
-            <w:proofErr w:type="spellEnd"/>
           </w:p>
         </w:tc>
         <w:tc>
@@ -15564,7 +15008,6 @@
                 <w:szCs w:val="28"/>
               </w:rPr>
             </w:pPr>
-            <w:proofErr w:type="spellStart"/>
             <w:r>
               <w:rPr>
                 <w:rFonts w:ascii="Times New Roman" w:hAnsi="Times New Roman" w:cs="Times New Roman"/>
@@ -15573,7 +15016,6 @@
               </w:rPr>
               <w:t>FastAPI</w:t>
             </w:r>
-            <w:proofErr w:type="spellEnd"/>
           </w:p>
         </w:tc>
         <w:tc>
@@ -15648,34 +15090,14 @@
                 <w:szCs w:val="28"/>
               </w:rPr>
             </w:pPr>
-            <w:proofErr w:type="spellStart"/>
             <w:r>
               <w:rPr>
                 <w:rFonts w:ascii="Times New Roman" w:hAnsi="Times New Roman" w:cs="Times New Roman"/>
                 <w:sz w:val="24"/>
                 <w:szCs w:val="28"/>
               </w:rPr>
-              <w:t>ChromaDB</w:t>
+              <w:t>ChromaDB &amp; LangChain</w:t>
             </w:r>
-            <w:proofErr w:type="spellEnd"/>
-            <w:r>
-              <w:rPr>
-                <w:rFonts w:ascii="Times New Roman" w:hAnsi="Times New Roman" w:cs="Times New Roman"/>
-                <w:sz w:val="24"/>
-                <w:szCs w:val="28"/>
-              </w:rPr>
-              <w:t xml:space="preserve"> &amp; </w:t>
-            </w:r>
-            <w:proofErr w:type="spellStart"/>
-            <w:r>
-              <w:rPr>
-                <w:rFonts w:ascii="Times New Roman" w:hAnsi="Times New Roman" w:cs="Times New Roman"/>
-                <w:sz w:val="24"/>
-                <w:szCs w:val="28"/>
-              </w:rPr>
-              <w:t>LangChain</w:t>
-            </w:r>
-            <w:proofErr w:type="spellEnd"/>
           </w:p>
         </w:tc>
         <w:tc>
@@ -15929,25 +15351,7 @@
           <w:sz w:val="24"/>
           <w:szCs w:val="28"/>
         </w:rPr>
-        <w:t xml:space="preserve">To mitigate the risk of AI hallucinations, the system implements a strict Retrieval-Augmented Generation (RAG) pipeline. Rather than allowing the LLM to access its general pre-trained knowledge base, the system forces a closed-loop generation process. When a user submits an answer, the input is converted into a vector and mathematically compared against the </w:t>
-      </w:r>
-      <w:proofErr w:type="spellStart"/>
-      <w:r>
-        <w:rPr>
-          <w:rFonts w:ascii="Times New Roman" w:hAnsi="Times New Roman" w:cs="Times New Roman"/>
-          <w:sz w:val="24"/>
-          <w:szCs w:val="28"/>
-        </w:rPr>
-        <w:t>ChromaDB</w:t>
-      </w:r>
-      <w:proofErr w:type="spellEnd"/>
-      <w:r>
-        <w:rPr>
-          <w:rFonts w:ascii="Times New Roman" w:hAnsi="Times New Roman" w:cs="Times New Roman"/>
-          <w:sz w:val="24"/>
-          <w:szCs w:val="28"/>
-        </w:rPr>
-        <w:t xml:space="preserve"> database. The most relevant non-profit policies are extracted and concatenated into a highly restrictive System Prompt. The Gemini model is then instructed to evaluate the user's answer </w:t>
+        <w:t>To mitigate the risk of AI hallucinations, the system implements a strict Retrieval-Augmented Generation (RAG) pipeline. Rather than allowing the LLM to access its general pre-trained knowledge base, the system forces a closed-loop generation process. When a user submits an answer, the input is converted into a vector and mathematically compared against the ChromaDB database. The most relevant non-profit policies are extracted and concatenated into a highly restrictive System Prompt. The Gemini model is then instructed to evaluate the user's answer </w:t>
       </w:r>
       <w:r>
         <w:rPr>
@@ -16189,43 +15593,7 @@
           <w:szCs w:val="28"/>
         </w:rPr>
         <w:lastRenderedPageBreak/>
-        <w:t xml:space="preserve">The Data Flow Diagram visually maps the trajectory of unstructured data as it transforms into actionable educational metrics. Raw donor emails enter the system via the </w:t>
-      </w:r>
-      <w:proofErr w:type="spellStart"/>
-      <w:r>
-        <w:rPr>
-          <w:rFonts w:ascii="Times New Roman" w:hAnsi="Times New Roman" w:cs="Times New Roman"/>
-          <w:sz w:val="24"/>
-          <w:szCs w:val="28"/>
-        </w:rPr>
-        <w:t>Streamlit</w:t>
-      </w:r>
-      <w:proofErr w:type="spellEnd"/>
-      <w:r>
-        <w:rPr>
-          <w:rFonts w:ascii="Times New Roman" w:hAnsi="Times New Roman" w:cs="Times New Roman"/>
-          <w:sz w:val="24"/>
-          <w:szCs w:val="28"/>
-        </w:rPr>
-        <w:t xml:space="preserve"> frontend and are packaged into lightweight JSON payloads. These payloads are securely transmitted via HTTP POST requests to the </w:t>
-      </w:r>
-      <w:proofErr w:type="spellStart"/>
-      <w:r>
-        <w:rPr>
-          <w:rFonts w:ascii="Times New Roman" w:hAnsi="Times New Roman" w:cs="Times New Roman"/>
-          <w:sz w:val="24"/>
-          <w:szCs w:val="28"/>
-        </w:rPr>
-        <w:t>FastAPI</w:t>
-      </w:r>
-      <w:proofErr w:type="spellEnd"/>
-      <w:r>
-        <w:rPr>
-          <w:rFonts w:ascii="Times New Roman" w:hAnsi="Times New Roman" w:cs="Times New Roman"/>
-          <w:sz w:val="24"/>
-          <w:szCs w:val="28"/>
-        </w:rPr>
-        <w:t xml:space="preserve"> router. The router acts as a traffic controller, seamlessly directing the text either to the Agentic Triage Engine for urgency calculation or to the RAG database for policy alignment and evaluation. The final output is routed back to the UI for user interaction.</w:t>
+        <w:t>The Data Flow Diagram visually maps the trajectory of unstructured data as it transforms into actionable educational metrics. Raw donor emails enter the system via the Streamlit frontend and are packaged into lightweight JSON payloads. These payloads are securely transmitted via HTTP POST requests to the FastAPI router. The router acts as a traffic controller, seamlessly directing the text either to the Agentic Triage Engine for urgency calculation or to the RAG database for policy alignment and evaluation. The final output is routed back to the UI for user interaction.</w:t>
       </w:r>
     </w:p>
     <w:p>
@@ -16681,97 +16049,7 @@
           <w:sz w:val="24"/>
           <w:szCs w:val="28"/>
         </w:rPr>
-        <w:t xml:space="preserve">To ensure backend stability and prevent injection attacks or data malformation, the system employs strict Object-Oriented programming principles via </w:t>
-      </w:r>
-      <w:proofErr w:type="spellStart"/>
-      <w:r>
-        <w:rPr>
-          <w:rFonts w:ascii="Times New Roman" w:hAnsi="Times New Roman" w:cs="Times New Roman"/>
-          <w:sz w:val="24"/>
-          <w:szCs w:val="28"/>
-        </w:rPr>
-        <w:t>Pydantic</w:t>
-      </w:r>
-      <w:proofErr w:type="spellEnd"/>
-      <w:r>
-        <w:rPr>
-          <w:rFonts w:ascii="Times New Roman" w:hAnsi="Times New Roman" w:cs="Times New Roman"/>
-          <w:sz w:val="24"/>
-          <w:szCs w:val="28"/>
-        </w:rPr>
-        <w:t xml:space="preserve"> data models. The Class Diagram below illustrates the structure of the API payloads. The </w:t>
-      </w:r>
-      <w:proofErr w:type="spellStart"/>
-      <w:r>
-        <w:rPr>
-          <w:rFonts w:ascii="Times New Roman" w:hAnsi="Times New Roman" w:cs="Times New Roman"/>
-          <w:sz w:val="24"/>
-          <w:szCs w:val="28"/>
-        </w:rPr>
-        <w:t>TriageRequest</w:t>
-      </w:r>
-      <w:proofErr w:type="spellEnd"/>
-      <w:r>
-        <w:rPr>
-          <w:rFonts w:ascii="Times New Roman" w:hAnsi="Times New Roman" w:cs="Times New Roman"/>
-          <w:sz w:val="24"/>
-          <w:szCs w:val="28"/>
-        </w:rPr>
-        <w:t> and </w:t>
-      </w:r>
-      <w:proofErr w:type="spellStart"/>
-      <w:r>
-        <w:rPr>
-          <w:rFonts w:ascii="Times New Roman" w:hAnsi="Times New Roman" w:cs="Times New Roman"/>
-          <w:sz w:val="24"/>
-          <w:szCs w:val="28"/>
-        </w:rPr>
-        <w:t>QuizGenerationRequest</w:t>
-      </w:r>
-      <w:proofErr w:type="spellEnd"/>
-      <w:r>
-        <w:rPr>
-          <w:rFonts w:ascii="Times New Roman" w:hAnsi="Times New Roman" w:cs="Times New Roman"/>
-          <w:sz w:val="24"/>
-          <w:szCs w:val="28"/>
-        </w:rPr>
-        <w:t> classes strictly expect raw string inputs. Conversely, the </w:t>
-      </w:r>
-      <w:proofErr w:type="spellStart"/>
-      <w:r>
-        <w:rPr>
-          <w:rFonts w:ascii="Times New Roman" w:hAnsi="Times New Roman" w:cs="Times New Roman"/>
-          <w:sz w:val="24"/>
-          <w:szCs w:val="28"/>
-        </w:rPr>
-        <w:t>EvaluationRequest</w:t>
-      </w:r>
-      <w:proofErr w:type="spellEnd"/>
-      <w:r>
-        <w:rPr>
-          <w:rFonts w:ascii="Times New Roman" w:hAnsi="Times New Roman" w:cs="Times New Roman"/>
-          <w:sz w:val="24"/>
-          <w:szCs w:val="28"/>
-        </w:rPr>
-        <w:t> class is more complex, requiring a composition of multiple </w:t>
-      </w:r>
-      <w:proofErr w:type="spellStart"/>
-      <w:r>
-        <w:rPr>
-          <w:rFonts w:ascii="Times New Roman" w:hAnsi="Times New Roman" w:cs="Times New Roman"/>
-          <w:sz w:val="24"/>
-          <w:szCs w:val="28"/>
-        </w:rPr>
-        <w:t>ChatMessage</w:t>
-      </w:r>
-      <w:proofErr w:type="spellEnd"/>
-      <w:r>
-        <w:rPr>
-          <w:rFonts w:ascii="Times New Roman" w:hAnsi="Times New Roman" w:cs="Times New Roman"/>
-          <w:sz w:val="24"/>
-          <w:szCs w:val="28"/>
-        </w:rPr>
-        <w:t> objects to accurately maintain the conversational history context during LLM generation.</w:t>
+        <w:t>To ensure backend stability and prevent injection attacks or data malformation, the system employs strict Object-Oriented programming principles via Pydantic data models. The Class Diagram below illustrates the structure of the API payloads. The TriageRequest and QuizGenerationRequest classes strictly expect raw string inputs. Conversely, the EvaluationRequest class is more complex, requiring a composition of multiple ChatMessage objects to accurately maintain the conversational history context during LLM generation.</w:t>
       </w:r>
     </w:p>
     <w:p>
@@ -17100,7 +16378,6 @@
         </w:rPr>
         <w:t xml:space="preserve">The development of the </w:t>
       </w:r>
-      <w:proofErr w:type="spellStart"/>
       <w:proofErr w:type="gramStart"/>
       <w:r>
         <w:rPr>
@@ -17110,7 +16387,6 @@
         </w:rPr>
         <w:t>Non Profit</w:t>
       </w:r>
-      <w:proofErr w:type="spellEnd"/>
       <w:proofErr w:type="gramEnd"/>
       <w:r>
         <w:rPr>
@@ -17350,7 +16626,6 @@
                 <w:szCs w:val="28"/>
               </w:rPr>
             </w:pPr>
-            <w:proofErr w:type="spellStart"/>
             <w:r>
               <w:rPr>
                 <w:rFonts w:ascii="Times New Roman" w:hAnsi="Times New Roman" w:cs="Times New Roman"/>
@@ -17359,7 +16634,6 @@
               </w:rPr>
               <w:t>Streamlit</w:t>
             </w:r>
-            <w:proofErr w:type="spellEnd"/>
           </w:p>
         </w:tc>
         <w:tc>
@@ -17435,34 +16709,14 @@
                 <w:szCs w:val="28"/>
               </w:rPr>
             </w:pPr>
-            <w:proofErr w:type="spellStart"/>
             <w:r>
               <w:rPr>
                 <w:rFonts w:ascii="Times New Roman" w:hAnsi="Times New Roman" w:cs="Times New Roman"/>
                 <w:sz w:val="24"/>
                 <w:szCs w:val="28"/>
               </w:rPr>
-              <w:t>FastAPI</w:t>
+              <w:t>FastAPI &amp; Uvicorn</w:t>
             </w:r>
-            <w:proofErr w:type="spellEnd"/>
-            <w:r>
-              <w:rPr>
-                <w:rFonts w:ascii="Times New Roman" w:hAnsi="Times New Roman" w:cs="Times New Roman"/>
-                <w:sz w:val="24"/>
-                <w:szCs w:val="28"/>
-              </w:rPr>
-              <w:t xml:space="preserve"> &amp; </w:t>
-            </w:r>
-            <w:proofErr w:type="spellStart"/>
-            <w:r>
-              <w:rPr>
-                <w:rFonts w:ascii="Times New Roman" w:hAnsi="Times New Roman" w:cs="Times New Roman"/>
-                <w:sz w:val="24"/>
-                <w:szCs w:val="28"/>
-              </w:rPr>
-              <w:t>Uvicorn</w:t>
-            </w:r>
-            <w:proofErr w:type="spellEnd"/>
           </w:p>
         </w:tc>
         <w:tc>
@@ -17542,18 +16796,8 @@
                 <w:sz w:val="24"/>
                 <w:szCs w:val="28"/>
               </w:rPr>
-              <w:t>google-</w:t>
+              <w:t>google-genai</w:t>
             </w:r>
-            <w:proofErr w:type="spellStart"/>
-            <w:r>
-              <w:rPr>
-                <w:rFonts w:ascii="Times New Roman" w:hAnsi="Times New Roman" w:cs="Times New Roman"/>
-                <w:sz w:val="24"/>
-                <w:szCs w:val="28"/>
-              </w:rPr>
-              <w:t>genai</w:t>
-            </w:r>
-            <w:proofErr w:type="spellEnd"/>
           </w:p>
         </w:tc>
         <w:tc>
@@ -17627,34 +16871,14 @@
                 <w:szCs w:val="28"/>
               </w:rPr>
             </w:pPr>
-            <w:proofErr w:type="spellStart"/>
             <w:r>
               <w:rPr>
                 <w:rFonts w:ascii="Times New Roman" w:hAnsi="Times New Roman" w:cs="Times New Roman"/>
                 <w:sz w:val="24"/>
                 <w:szCs w:val="28"/>
               </w:rPr>
-              <w:t>LangChain</w:t>
+              <w:t>LangChain &amp; PyPDF</w:t>
             </w:r>
-            <w:proofErr w:type="spellEnd"/>
-            <w:r>
-              <w:rPr>
-                <w:rFonts w:ascii="Times New Roman" w:hAnsi="Times New Roman" w:cs="Times New Roman"/>
-                <w:sz w:val="24"/>
-                <w:szCs w:val="28"/>
-              </w:rPr>
-              <w:t xml:space="preserve"> &amp; </w:t>
-            </w:r>
-            <w:proofErr w:type="spellStart"/>
-            <w:r>
-              <w:rPr>
-                <w:rFonts w:ascii="Times New Roman" w:hAnsi="Times New Roman" w:cs="Times New Roman"/>
-                <w:sz w:val="24"/>
-                <w:szCs w:val="28"/>
-              </w:rPr>
-              <w:t>PyPDF</w:t>
-            </w:r>
-            <w:proofErr w:type="spellEnd"/>
           </w:p>
         </w:tc>
         <w:tc>
@@ -17728,7 +16952,6 @@
                 <w:szCs w:val="28"/>
               </w:rPr>
             </w:pPr>
-            <w:proofErr w:type="spellStart"/>
             <w:r>
               <w:rPr>
                 <w:rFonts w:ascii="Times New Roman" w:hAnsi="Times New Roman" w:cs="Times New Roman"/>
@@ -17737,7 +16960,6 @@
               </w:rPr>
               <w:t>ChromaDB</w:t>
             </w:r>
-            <w:proofErr w:type="spellEnd"/>
           </w:p>
         </w:tc>
         <w:tc>
@@ -17983,27 +17205,7 @@
           <w:szCs w:val="28"/>
           <w:lang w:val="en-IN"/>
         </w:rPr>
-        <w:t>: Implements the Graphical User Interface. It manages the chat history session state and enforces a two-step UX flow (Triage $\</w:t>
-      </w:r>
-      <w:proofErr w:type="spellStart"/>
-      <w:r>
-        <w:rPr>
-          <w:rFonts w:ascii="Times New Roman" w:hAnsi="Times New Roman" w:cs="Times New Roman"/>
-          <w:sz w:val="24"/>
-          <w:szCs w:val="28"/>
-          <w:lang w:val="en-IN"/>
-        </w:rPr>
-        <w:t>rightarrow</w:t>
-      </w:r>
-      <w:proofErr w:type="spellEnd"/>
-      <w:r>
-        <w:rPr>
-          <w:rFonts w:ascii="Times New Roman" w:hAnsi="Times New Roman" w:cs="Times New Roman"/>
-          <w:sz w:val="24"/>
-          <w:szCs w:val="28"/>
-          <w:lang w:val="en-IN"/>
-        </w:rPr>
-        <w:t>$ Educational Quiz). It contains no AI logic, serving purely to package user inputs into JSON payloads.</w:t>
+        <w:t>: Implements the Graphical User Interface. It manages the chat history session state and enforces a two-step UX flow (Triage $\rightarrow$ Educational Quiz). It contains no AI logic, serving purely to package user inputs into JSON payloads.</w:t>
       </w:r>
     </w:p>
     <w:p>
@@ -18042,87 +17244,7 @@
           <w:szCs w:val="28"/>
           <w:lang w:val="en-IN"/>
         </w:rPr>
-        <w:t xml:space="preserve">: Initializes the </w:t>
-      </w:r>
-      <w:proofErr w:type="spellStart"/>
-      <w:r>
-        <w:rPr>
-          <w:rFonts w:ascii="Times New Roman" w:hAnsi="Times New Roman" w:cs="Times New Roman"/>
-          <w:sz w:val="24"/>
-          <w:szCs w:val="28"/>
-          <w:lang w:val="en-IN"/>
-        </w:rPr>
-        <w:t>FastAPI</w:t>
-      </w:r>
-      <w:proofErr w:type="spellEnd"/>
-      <w:r>
-        <w:rPr>
-          <w:rFonts w:ascii="Times New Roman" w:hAnsi="Times New Roman" w:cs="Times New Roman"/>
-          <w:sz w:val="24"/>
-          <w:szCs w:val="28"/>
-          <w:lang w:val="en-IN"/>
-        </w:rPr>
-        <w:t xml:space="preserve"> server. It defines strict endpoint decorators (e.g., /</w:t>
-      </w:r>
-      <w:proofErr w:type="spellStart"/>
-      <w:r>
-        <w:rPr>
-          <w:rFonts w:ascii="Times New Roman" w:hAnsi="Times New Roman" w:cs="Times New Roman"/>
-          <w:sz w:val="24"/>
-          <w:szCs w:val="28"/>
-          <w:lang w:val="en-IN"/>
-        </w:rPr>
-        <w:t>triage_email</w:t>
-      </w:r>
-      <w:proofErr w:type="spellEnd"/>
-      <w:r>
-        <w:rPr>
-          <w:rFonts w:ascii="Times New Roman" w:hAnsi="Times New Roman" w:cs="Times New Roman"/>
-          <w:sz w:val="24"/>
-          <w:szCs w:val="28"/>
-          <w:lang w:val="en-IN"/>
-        </w:rPr>
-        <w:t> and /</w:t>
-      </w:r>
-      <w:proofErr w:type="spellStart"/>
-      <w:r>
-        <w:rPr>
-          <w:rFonts w:ascii="Times New Roman" w:hAnsi="Times New Roman" w:cs="Times New Roman"/>
-          <w:sz w:val="24"/>
-          <w:szCs w:val="28"/>
-          <w:lang w:val="en-IN"/>
-        </w:rPr>
-        <w:t>evaluate_answer</w:t>
-      </w:r>
-      <w:proofErr w:type="spellEnd"/>
-      <w:r>
-        <w:rPr>
-          <w:rFonts w:ascii="Times New Roman" w:hAnsi="Times New Roman" w:cs="Times New Roman"/>
-          <w:sz w:val="24"/>
-          <w:szCs w:val="28"/>
-          <w:lang w:val="en-IN"/>
-        </w:rPr>
-        <w:t xml:space="preserve">) protected by </w:t>
-      </w:r>
-      <w:proofErr w:type="spellStart"/>
-      <w:r>
-        <w:rPr>
-          <w:rFonts w:ascii="Times New Roman" w:hAnsi="Times New Roman" w:cs="Times New Roman"/>
-          <w:sz w:val="24"/>
-          <w:szCs w:val="28"/>
-          <w:lang w:val="en-IN"/>
-        </w:rPr>
-        <w:t>Pydantic</w:t>
-      </w:r>
-      <w:proofErr w:type="spellEnd"/>
-      <w:r>
-        <w:rPr>
-          <w:rFonts w:ascii="Times New Roman" w:hAnsi="Times New Roman" w:cs="Times New Roman"/>
-          <w:sz w:val="24"/>
-          <w:szCs w:val="28"/>
-          <w:lang w:val="en-IN"/>
-        </w:rPr>
-        <w:t xml:space="preserve"> data models to prevent malformed data injection.</w:t>
+        <w:t>: Initializes the FastAPI server. It defines strict endpoint decorators (e.g., /triage_email and /evaluate_answer) protected by Pydantic data models to prevent malformed data injection.</w:t>
       </w:r>
     </w:p>
     <w:p>
@@ -18160,67 +17282,7 @@
           <w:szCs w:val="28"/>
           <w:lang w:val="en-IN"/>
         </w:rPr>
-        <w:t xml:space="preserve">: Initializes the Persistent </w:t>
-      </w:r>
-      <w:proofErr w:type="spellStart"/>
-      <w:r>
-        <w:rPr>
-          <w:rFonts w:ascii="Times New Roman" w:hAnsi="Times New Roman" w:cs="Times New Roman"/>
-          <w:sz w:val="24"/>
-          <w:szCs w:val="28"/>
-          <w:lang w:val="en-IN"/>
-        </w:rPr>
-        <w:t>ChromaDB</w:t>
-      </w:r>
-      <w:proofErr w:type="spellEnd"/>
-      <w:r>
-        <w:rPr>
-          <w:rFonts w:ascii="Times New Roman" w:hAnsi="Times New Roman" w:cs="Times New Roman"/>
-          <w:sz w:val="24"/>
-          <w:szCs w:val="28"/>
-          <w:lang w:val="en-IN"/>
-        </w:rPr>
-        <w:t xml:space="preserve"> client. Upon server boot, it scans the /data directory, utilizes </w:t>
-      </w:r>
-      <w:proofErr w:type="spellStart"/>
-      <w:r>
-        <w:rPr>
-          <w:rFonts w:ascii="Times New Roman" w:hAnsi="Times New Roman" w:cs="Times New Roman"/>
-          <w:sz w:val="24"/>
-          <w:szCs w:val="28"/>
-          <w:lang w:val="en-IN"/>
-        </w:rPr>
-        <w:t>LangChain's</w:t>
-      </w:r>
-      <w:proofErr w:type="spellEnd"/>
-      <w:r>
-        <w:rPr>
-          <w:rFonts w:ascii="Times New Roman" w:hAnsi="Times New Roman" w:cs="Times New Roman"/>
-          <w:sz w:val="24"/>
-          <w:szCs w:val="28"/>
-          <w:lang w:val="en-IN"/>
-        </w:rPr>
-        <w:t xml:space="preserve"> </w:t>
-      </w:r>
-      <w:proofErr w:type="spellStart"/>
-      <w:r>
-        <w:rPr>
-          <w:rFonts w:ascii="Times New Roman" w:hAnsi="Times New Roman" w:cs="Times New Roman"/>
-          <w:sz w:val="24"/>
-          <w:szCs w:val="28"/>
-          <w:lang w:val="en-IN"/>
-        </w:rPr>
-        <w:t>PyPDFLoader</w:t>
-      </w:r>
-      <w:proofErr w:type="spellEnd"/>
-      <w:r>
-        <w:rPr>
-          <w:rFonts w:ascii="Times New Roman" w:hAnsi="Times New Roman" w:cs="Times New Roman"/>
-          <w:sz w:val="24"/>
-          <w:szCs w:val="28"/>
-          <w:lang w:val="en-IN"/>
-        </w:rPr>
-        <w:t xml:space="preserve"> to extract text from non-profit policy documents, chunks the data to optimize the context window, and embeds it into the vector space.</w:t>
+        <w:t>: Initializes the Persistent ChromaDB client. Upon server boot, it scans the /data directory, utilizes LangChain's PyPDFLoader to extract text from non-profit policy documents, chunks the data to optimize the context window, and embeds it into the vector space.</w:t>
       </w:r>
     </w:p>
     <w:p>
@@ -18258,27 +17320,7 @@
           <w:szCs w:val="28"/>
           <w:lang w:val="en-IN"/>
         </w:rPr>
-        <w:t xml:space="preserve">: The core reasoning engine. It utilizes advanced prompt engineering to constrain the LLM. It forces the output of the Triage Agent into a </w:t>
-      </w:r>
-      <w:proofErr w:type="spellStart"/>
-      <w:r>
-        <w:rPr>
-          <w:rFonts w:ascii="Times New Roman" w:hAnsi="Times New Roman" w:cs="Times New Roman"/>
-          <w:sz w:val="24"/>
-          <w:szCs w:val="28"/>
-          <w:lang w:val="en-IN"/>
-        </w:rPr>
-        <w:t>parsable</w:t>
-      </w:r>
-      <w:proofErr w:type="spellEnd"/>
-      <w:r>
-        <w:rPr>
-          <w:rFonts w:ascii="Times New Roman" w:hAnsi="Times New Roman" w:cs="Times New Roman"/>
-          <w:sz w:val="24"/>
-          <w:szCs w:val="28"/>
-          <w:lang w:val="en-IN"/>
-        </w:rPr>
-        <w:t xml:space="preserve"> JSON schema, and dynamically formats RAG-evaluated responses into Markdown scorecards.</w:t>
+        <w:t>: The core reasoning engine. It utilizes advanced prompt engineering to constrain the LLM. It forces the output of the Triage Agent into a parsable JSON schema, and dynamically formats RAG-evaluated responses into Markdown scorecards.</w:t>
       </w:r>
     </w:p>
     <w:p>
@@ -18349,79 +17391,7 @@
           <w:sz w:val="24"/>
           <w:szCs w:val="28"/>
         </w:rPr>
-        <w:t>To transition the application from a local prototype to a production-ready cloud service, extensive DevOps methodologies were implemented. A root </w:t>
-      </w:r>
-      <w:proofErr w:type="spellStart"/>
-      <w:r>
-        <w:rPr>
-          <w:rFonts w:ascii="Times New Roman" w:hAnsi="Times New Roman" w:cs="Times New Roman"/>
-          <w:sz w:val="24"/>
-          <w:szCs w:val="28"/>
-        </w:rPr>
-        <w:t>Dockerfile</w:t>
-      </w:r>
-      <w:proofErr w:type="spellEnd"/>
-      <w:r>
-        <w:rPr>
-          <w:rFonts w:ascii="Times New Roman" w:hAnsi="Times New Roman" w:cs="Times New Roman"/>
-          <w:sz w:val="24"/>
-          <w:szCs w:val="28"/>
-        </w:rPr>
-        <w:t> was authored to package the Python environment, libraries, and source code into an isolated Linux image. To handle the microservices architecture, a docker-</w:t>
-      </w:r>
-      <w:proofErr w:type="spellStart"/>
-      <w:r>
-        <w:rPr>
-          <w:rFonts w:ascii="Times New Roman" w:hAnsi="Times New Roman" w:cs="Times New Roman"/>
-          <w:sz w:val="24"/>
-          <w:szCs w:val="28"/>
-        </w:rPr>
-        <w:t>compose.yml</w:t>
-      </w:r>
-      <w:proofErr w:type="spellEnd"/>
-      <w:r>
-        <w:rPr>
-          <w:rFonts w:ascii="Times New Roman" w:hAnsi="Times New Roman" w:cs="Times New Roman"/>
-          <w:sz w:val="24"/>
-          <w:szCs w:val="28"/>
-        </w:rPr>
-        <w:t> file was implemented to orchestrate the simultaneous booting and networking of the frontend and backend containers. Furthermore, a Continuous Integration (CI) pipeline was established via .</w:t>
-      </w:r>
-      <w:proofErr w:type="spellStart"/>
-      <w:r>
-        <w:rPr>
-          <w:rFonts w:ascii="Times New Roman" w:hAnsi="Times New Roman" w:cs="Times New Roman"/>
-          <w:sz w:val="24"/>
-          <w:szCs w:val="28"/>
-        </w:rPr>
-        <w:t>github</w:t>
-      </w:r>
-      <w:proofErr w:type="spellEnd"/>
-      <w:r>
-        <w:rPr>
-          <w:rFonts w:ascii="Times New Roman" w:hAnsi="Times New Roman" w:cs="Times New Roman"/>
-          <w:sz w:val="24"/>
-          <w:szCs w:val="28"/>
-        </w:rPr>
-        <w:t>/workflows/</w:t>
-      </w:r>
-      <w:proofErr w:type="spellStart"/>
-      <w:r>
-        <w:rPr>
-          <w:rFonts w:ascii="Times New Roman" w:hAnsi="Times New Roman" w:cs="Times New Roman"/>
-          <w:sz w:val="24"/>
-          <w:szCs w:val="28"/>
-        </w:rPr>
-        <w:t>ci.yml</w:t>
-      </w:r>
-      <w:proofErr w:type="spellEnd"/>
-      <w:r>
-        <w:rPr>
-          <w:rFonts w:ascii="Times New Roman" w:hAnsi="Times New Roman" w:cs="Times New Roman"/>
-          <w:sz w:val="24"/>
-          <w:szCs w:val="28"/>
-        </w:rPr>
-        <w:t>. This pipeline automatically provisions an Ubuntu server upon every GitHub push, executes flake8 for syntax linting, and performs a test Docker build to guarantee that corrupted code is never merged into the main branch.</w:t>
+        <w:t>To transition the application from a local prototype to a production-ready cloud service, extensive DevOps methodologies were implemented. A root Dockerfile was authored to package the Python environment, libraries, and source code into an isolated Linux image. To handle the microservices architecture, a docker-compose.yml file was implemented to orchestrate the simultaneous booting and networking of the frontend and backend containers. Furthermore, a Continuous Integration (CI) pipeline was established via .github/workflows/ci.yml. This pipeline automatically provisions an Ubuntu server upon every GitHub push, executes flake8 for syntax linting, and performs a test Docker build to guarantee that corrupted code is never merged into the main branch.</w:t>
       </w:r>
     </w:p>
     <w:p>
@@ -18686,25 +17656,7 @@
           <w:sz w:val="24"/>
           <w:szCs w:val="28"/>
         </w:rPr>
-        <w:t>The system was engineered for low-friction maintenance. The Vector Database operates autonomously; administrators simply need to drop new or updated PDF policy documents into the /data directory and delete the hidden </w:t>
-      </w:r>
-      <w:proofErr w:type="spellStart"/>
-      <w:r>
-        <w:rPr>
-          <w:rFonts w:ascii="Times New Roman" w:hAnsi="Times New Roman" w:cs="Times New Roman"/>
-          <w:sz w:val="24"/>
-          <w:szCs w:val="28"/>
-        </w:rPr>
-        <w:t>chroma_db</w:t>
-      </w:r>
-      <w:proofErr w:type="spellEnd"/>
-      <w:r>
-        <w:rPr>
-          <w:rFonts w:ascii="Times New Roman" w:hAnsi="Times New Roman" w:cs="Times New Roman"/>
-          <w:sz w:val="24"/>
-          <w:szCs w:val="28"/>
-        </w:rPr>
-        <w:t> cache folder. Upon the next server reboot, the system automatically rebuilds the mathematical embeddings to reflect the latest organizational rules. Additionally, API key rotation is handled entirely externally via the .env file, requiring zero alterations to the source code.</w:t>
+        <w:t>The system was engineered for low-friction maintenance. The Vector Database operates autonomously; administrators simply need to drop new or updated PDF policy documents into the /data directory and delete the hidden chroma_db cache folder. Upon the next server reboot, the system automatically rebuilds the mathematical embeddings to reflect the latest organizational rules. Additionally, API key rotation is handled entirely externally via the .env file, requiring zero alterations to the source code.</w:t>
       </w:r>
     </w:p>
     <w:p>
@@ -18794,62 +17746,18 @@
         </w:rPr>
         <w:t>Clone the repository: git clone [</w:t>
       </w:r>
-      <w:proofErr w:type="spellStart"/>
-      <w:r>
-        <w:rPr>
-          <w:rFonts w:ascii="Times New Roman" w:hAnsi="Times New Roman" w:cs="Times New Roman"/>
-          <w:sz w:val="24"/>
-          <w:szCs w:val="28"/>
-          <w:lang w:val="en-IN"/>
-        </w:rPr>
-        <w:fldChar w:fldCharType="begin"/>
-      </w:r>
-      <w:r>
-        <w:rPr>
-          <w:rFonts w:ascii="Times New Roman" w:hAnsi="Times New Roman" w:cs="Times New Roman"/>
-          <w:sz w:val="24"/>
-          <w:szCs w:val="28"/>
-          <w:lang w:val="en-IN"/>
-        </w:rPr>
-        <w:instrText>HYPERLINK "https://github.com/RohanRajput0048/Integrated_Non_Profit_Agent"</w:instrText>
-      </w:r>
-      <w:r>
-        <w:rPr>
-          <w:rFonts w:ascii="Times New Roman" w:hAnsi="Times New Roman" w:cs="Times New Roman"/>
-          <w:sz w:val="24"/>
-          <w:szCs w:val="28"/>
-          <w:lang w:val="en-IN"/>
-        </w:rPr>
-      </w:r>
-      <w:r>
-        <w:rPr>
-          <w:rFonts w:ascii="Times New Roman" w:hAnsi="Times New Roman" w:cs="Times New Roman"/>
-          <w:sz w:val="24"/>
-          <w:szCs w:val="28"/>
-          <w:lang w:val="en-IN"/>
-        </w:rPr>
-        <w:fldChar w:fldCharType="separate"/>
-      </w:r>
-      <w:r>
-        <w:rPr>
-          <w:rStyle w:val="Hyperlink"/>
-          <w:rFonts w:ascii="Times New Roman" w:hAnsi="Times New Roman" w:cs="Times New Roman"/>
-          <w:sz w:val="24"/>
-          <w:szCs w:val="28"/>
-          <w:lang w:val="en-IN"/>
-        </w:rPr>
-        <w:t>repository_url</w:t>
-      </w:r>
-      <w:proofErr w:type="spellEnd"/>
-      <w:r>
-        <w:rPr>
-          <w:rFonts w:ascii="Times New Roman" w:hAnsi="Times New Roman" w:cs="Times New Roman"/>
-          <w:sz w:val="24"/>
-          <w:szCs w:val="28"/>
-          <w:lang w:val="en-IN"/>
-        </w:rPr>
-        <w:fldChar w:fldCharType="end"/>
-      </w:r>
+      <w:hyperlink r:id="rId20" w:history="1">
+        <w:r>
+          <w:rPr>
+            <w:rStyle w:val="Hyperlink"/>
+            <w:rFonts w:ascii="Times New Roman" w:hAnsi="Times New Roman" w:cs="Times New Roman"/>
+            <w:sz w:val="24"/>
+            <w:szCs w:val="28"/>
+            <w:lang w:val="en-IN"/>
+          </w:rPr>
+          <w:t>repository_url</w:t>
+        </w:r>
+      </w:hyperlink>
       <w:r>
         <w:rPr>
           <w:rFonts w:ascii="Times New Roman" w:hAnsi="Times New Roman" w:cs="Times New Roman"/>
@@ -18884,19 +17792,8 @@
           <w:szCs w:val="28"/>
           <w:lang w:val="en-IN"/>
         </w:rPr>
-        <w:t>Create a .env file in the root directory containing: GEMINI_API_KEY=</w:t>
-      </w:r>
-      <w:proofErr w:type="spellStart"/>
-      <w:r>
-        <w:rPr>
-          <w:rFonts w:ascii="Times New Roman" w:hAnsi="Times New Roman" w:cs="Times New Roman"/>
-          <w:sz w:val="24"/>
-          <w:szCs w:val="28"/>
-          <w:lang w:val="en-IN"/>
-        </w:rPr>
-        <w:t>your_key_here</w:t>
-      </w:r>
-      <w:proofErr w:type="spellEnd"/>
+        <w:t>Create a .env file in the root directory containing: GEMINI_API_KEY=your_key_here</w:t>
+      </w:r>
     </w:p>
     <w:p>
       <w:pPr>
@@ -18933,55 +17830,7 @@
           <w:szCs w:val="28"/>
           <w:lang w:val="en-IN"/>
         </w:rPr>
-        <w:t xml:space="preserve">(Alternatively, for local development without Docker, dependencies can be installed via pip install -r requirements.txt, followed by manually launching </w:t>
-      </w:r>
-      <w:proofErr w:type="spellStart"/>
-      <w:r>
-        <w:rPr>
-          <w:rFonts w:ascii="Times New Roman" w:hAnsi="Times New Roman" w:cs="Times New Roman"/>
-          <w:i/>
-          <w:iCs/>
-          <w:sz w:val="24"/>
-          <w:szCs w:val="28"/>
-          <w:lang w:val="en-IN"/>
-        </w:rPr>
-        <w:t>Uvicorn</w:t>
-      </w:r>
-      <w:proofErr w:type="spellEnd"/>
-      <w:r>
-        <w:rPr>
-          <w:rFonts w:ascii="Times New Roman" w:hAnsi="Times New Roman" w:cs="Times New Roman"/>
-          <w:i/>
-          <w:iCs/>
-          <w:sz w:val="24"/>
-          <w:szCs w:val="28"/>
-          <w:lang w:val="en-IN"/>
-        </w:rPr>
-        <w:t xml:space="preserve"> and </w:t>
-      </w:r>
-      <w:proofErr w:type="spellStart"/>
-      <w:r>
-        <w:rPr>
-          <w:rFonts w:ascii="Times New Roman" w:hAnsi="Times New Roman" w:cs="Times New Roman"/>
-          <w:i/>
-          <w:iCs/>
-          <w:sz w:val="24"/>
-          <w:szCs w:val="28"/>
-          <w:lang w:val="en-IN"/>
-        </w:rPr>
-        <w:t>Streamlit</w:t>
-      </w:r>
-      <w:proofErr w:type="spellEnd"/>
-      <w:r>
-        <w:rPr>
-          <w:rFonts w:ascii="Times New Roman" w:hAnsi="Times New Roman" w:cs="Times New Roman"/>
-          <w:i/>
-          <w:iCs/>
-          <w:sz w:val="24"/>
-          <w:szCs w:val="28"/>
-          <w:lang w:val="en-IN"/>
-        </w:rPr>
-        <w:t>).</w:t>
+        <w:t>(Alternatively, for local development without Docker, dependencies can be installed via pip install -r requirements.txt, followed by manually launching Uvicorn and Streamlit).</w:t>
       </w:r>
     </w:p>
     <w:p>
@@ -19319,27 +18168,7 @@
           <w:szCs w:val="28"/>
           <w:lang w:val="en-IN"/>
         </w:rPr>
-        <w:t xml:space="preserve">The Knowledge Base (RAG Dataset): This consisted of synthetic internal policy documents (PDFs) detailing hypothetical Standard Operating Procedures (SOPs), refund policies, and communication guidelines for the non-profit organization. These were ingested and embedded into the local </w:t>
-      </w:r>
-      <w:proofErr w:type="spellStart"/>
-      <w:r>
-        <w:rPr>
-          <w:rFonts w:ascii="Times New Roman" w:hAnsi="Times New Roman" w:cs="Times New Roman"/>
-          <w:sz w:val="24"/>
-          <w:szCs w:val="28"/>
-          <w:lang w:val="en-IN"/>
-        </w:rPr>
-        <w:t>ChromaDB</w:t>
-      </w:r>
-      <w:proofErr w:type="spellEnd"/>
-      <w:r>
-        <w:rPr>
-          <w:rFonts w:ascii="Times New Roman" w:hAnsi="Times New Roman" w:cs="Times New Roman"/>
-          <w:sz w:val="24"/>
-          <w:szCs w:val="28"/>
-          <w:lang w:val="en-IN"/>
-        </w:rPr>
-        <w:t xml:space="preserve"> vector space.</w:t>
+        <w:t>The Knowledge Base (RAG Dataset): This consisted of synthetic internal policy documents (PDFs) detailing hypothetical Standard Operating Procedures (SOPs), refund policies, and communication guidelines for the non-profit organization. These were ingested and embedded into the local ChromaDB vector space.</w:t>
       </w:r>
     </w:p>
     <w:p>
@@ -19389,27 +18218,7 @@
           <w:szCs w:val="28"/>
           <w:lang w:val="en-IN"/>
         </w:rPr>
-        <w:t>The system was hosted via Docker on a standard desktop environment, utilizing the google-</w:t>
-      </w:r>
-      <w:proofErr w:type="spellStart"/>
-      <w:r>
-        <w:rPr>
-          <w:rFonts w:ascii="Times New Roman" w:hAnsi="Times New Roman" w:cs="Times New Roman"/>
-          <w:sz w:val="24"/>
-          <w:szCs w:val="28"/>
-          <w:lang w:val="en-IN"/>
-        </w:rPr>
-        <w:t>genai</w:t>
-      </w:r>
-      <w:proofErr w:type="spellEnd"/>
-      <w:r>
-        <w:rPr>
-          <w:rFonts w:ascii="Times New Roman" w:hAnsi="Times New Roman" w:cs="Times New Roman"/>
-          <w:sz w:val="24"/>
-          <w:szCs w:val="28"/>
-          <w:lang w:val="en-IN"/>
-        </w:rPr>
-        <w:t> SDK to interface with the Gemini 2.5 Flash model for high-speed, cost-effective inference.</w:t>
+        <w:t>The system was hosted via Docker on a standard desktop environment, utilizing the google-genai SDK to interface with the Gemini 2.5 Flash model for high-speed, cost-effective inference.</w:t>
       </w:r>
     </w:p>
     <w:p>
@@ -19500,67 +18309,7 @@
           <w:szCs w:val="28"/>
           <w:lang w:val="en-IN"/>
         </w:rPr>
-        <w:t xml:space="preserve">JSON Schema Adherence (100%): Thanks to rigid prompt engineering and </w:t>
-      </w:r>
-      <w:proofErr w:type="spellStart"/>
-      <w:r>
-        <w:rPr>
-          <w:rFonts w:ascii="Times New Roman" w:hAnsi="Times New Roman" w:cs="Times New Roman"/>
-          <w:sz w:val="24"/>
-          <w:szCs w:val="28"/>
-          <w:lang w:val="en-IN"/>
-        </w:rPr>
-        <w:t>Pydantic</w:t>
-      </w:r>
-      <w:proofErr w:type="spellEnd"/>
-      <w:r>
-        <w:rPr>
-          <w:rFonts w:ascii="Times New Roman" w:hAnsi="Times New Roman" w:cs="Times New Roman"/>
-          <w:sz w:val="24"/>
-          <w:szCs w:val="28"/>
-          <w:lang w:val="en-IN"/>
-        </w:rPr>
-        <w:t xml:space="preserve"> validation, the Agentic Triage system successfully outputted </w:t>
-      </w:r>
-      <w:proofErr w:type="spellStart"/>
-      <w:r>
-        <w:rPr>
-          <w:rFonts w:ascii="Times New Roman" w:hAnsi="Times New Roman" w:cs="Times New Roman"/>
-          <w:sz w:val="24"/>
-          <w:szCs w:val="28"/>
-          <w:lang w:val="en-IN"/>
-        </w:rPr>
-        <w:t>parsable</w:t>
-      </w:r>
-      <w:proofErr w:type="spellEnd"/>
-      <w:r>
-        <w:rPr>
-          <w:rFonts w:ascii="Times New Roman" w:hAnsi="Times New Roman" w:cs="Times New Roman"/>
-          <w:sz w:val="24"/>
-          <w:szCs w:val="28"/>
-          <w:lang w:val="en-IN"/>
-        </w:rPr>
-        <w:t xml:space="preserve"> JSON formats (urgency, </w:t>
-      </w:r>
-      <w:proofErr w:type="spellStart"/>
-      <w:r>
-        <w:rPr>
-          <w:rFonts w:ascii="Times New Roman" w:hAnsi="Times New Roman" w:cs="Times New Roman"/>
-          <w:sz w:val="24"/>
-          <w:szCs w:val="28"/>
-          <w:lang w:val="en-IN"/>
-        </w:rPr>
-        <w:t>sla_days</w:t>
-      </w:r>
-      <w:proofErr w:type="spellEnd"/>
-      <w:r>
-        <w:rPr>
-          <w:rFonts w:ascii="Times New Roman" w:hAnsi="Times New Roman" w:cs="Times New Roman"/>
-          <w:sz w:val="24"/>
-          <w:szCs w:val="28"/>
-          <w:lang w:val="en-IN"/>
-        </w:rPr>
-        <w:t>, reason) in all test cases without failing or throwing backend parsing errors.</w:t>
+        <w:t>JSON Schema Adherence (100%): Thanks to rigid prompt engineering and Pydantic validation, the Agentic Triage system successfully outputted parsable JSON formats (urgency, sla_days, reason) in all test cases without failing or throwing backend parsing errors.</w:t>
       </w:r>
     </w:p>
     <w:p>
@@ -19614,47 +18363,7 @@
           <w:szCs w:val="28"/>
           <w:lang w:val="en-IN"/>
         </w:rPr>
-        <w:t>System Latency: The decoupled Microservices architecture (</w:t>
-      </w:r>
-      <w:proofErr w:type="spellStart"/>
-      <w:r>
-        <w:rPr>
-          <w:rFonts w:ascii="Times New Roman" w:hAnsi="Times New Roman" w:cs="Times New Roman"/>
-          <w:sz w:val="24"/>
-          <w:szCs w:val="28"/>
-          <w:lang w:val="en-IN"/>
-        </w:rPr>
-        <w:t>FastAPI</w:t>
-      </w:r>
-      <w:proofErr w:type="spellEnd"/>
-      <w:r>
-        <w:rPr>
-          <w:rFonts w:ascii="Times New Roman" w:hAnsi="Times New Roman" w:cs="Times New Roman"/>
-          <w:sz w:val="24"/>
-          <w:szCs w:val="28"/>
-          <w:lang w:val="en-IN"/>
-        </w:rPr>
-        <w:t xml:space="preserve">) demonstrated high resilience. Triage calculations and 5-question quiz generation averaged a sub-4 second response time, preventing UI freezing within the </w:t>
-      </w:r>
-      <w:proofErr w:type="spellStart"/>
-      <w:r>
-        <w:rPr>
-          <w:rFonts w:ascii="Times New Roman" w:hAnsi="Times New Roman" w:cs="Times New Roman"/>
-          <w:sz w:val="24"/>
-          <w:szCs w:val="28"/>
-          <w:lang w:val="en-IN"/>
-        </w:rPr>
-        <w:t>Streamlit</w:t>
-      </w:r>
-      <w:proofErr w:type="spellEnd"/>
-      <w:r>
-        <w:rPr>
-          <w:rFonts w:ascii="Times New Roman" w:hAnsi="Times New Roman" w:cs="Times New Roman"/>
-          <w:sz w:val="24"/>
-          <w:szCs w:val="28"/>
-          <w:lang w:val="en-IN"/>
-        </w:rPr>
-        <w:t xml:space="preserve"> frontend.</w:t>
+        <w:t>System Latency: The decoupled Microservices architecture (FastAPI) demonstrated high resilience. Triage calculations and 5-question quiz generation averaged a sub-4 second response time, preventing UI freezing within the Streamlit frontend.</w:t>
       </w:r>
     </w:p>
     <w:p>
@@ -19857,7 +18566,7 @@
                     <pic:cNvPicPr/>
                   </pic:nvPicPr>
                   <pic:blipFill>
-                    <a:blip r:embed="rId20">
+                    <a:blip r:embed="rId21">
                       <a:extLst>
                         <a:ext uri="{28A0092B-C50C-407E-A947-70E740481C1C}">
                           <a14:useLocalDpi xmlns:a14="http://schemas.microsoft.com/office/drawing/2010/main" val="0"/>
@@ -19893,27 +18602,7 @@
           <w:szCs w:val="28"/>
           <w:lang w:val="en-IN"/>
         </w:rPr>
-        <w:t xml:space="preserve">The </w:t>
-      </w:r>
-      <w:proofErr w:type="spellStart"/>
-      <w:r>
-        <w:rPr>
-          <w:rFonts w:ascii="Times New Roman" w:hAnsi="Times New Roman" w:cs="Times New Roman"/>
-          <w:sz w:val="24"/>
-          <w:szCs w:val="28"/>
-          <w:lang w:val="en-IN"/>
-        </w:rPr>
-        <w:t>Streamlit</w:t>
-      </w:r>
-      <w:proofErr w:type="spellEnd"/>
-      <w:r>
-        <w:rPr>
-          <w:rFonts w:ascii="Times New Roman" w:hAnsi="Times New Roman" w:cs="Times New Roman"/>
-          <w:sz w:val="24"/>
-          <w:szCs w:val="28"/>
-          <w:lang w:val="en-IN"/>
-        </w:rPr>
-        <w:t xml:space="preserve"> frontend successfully abstracts the complex backend AI logic into an intuitive, zero-code interface.</w:t>
+        <w:t>The Streamlit frontend successfully abstracts the complex backend AI logic into an intuitive, zero-code interface.</w:t>
       </w:r>
     </w:p>
     <w:p>
@@ -20003,7 +18692,7 @@
                     <pic:cNvPicPr/>
                   </pic:nvPicPr>
                   <pic:blipFill>
-                    <a:blip r:embed="rId21">
+                    <a:blip r:embed="rId22">
                       <a:extLst>
                         <a:ext uri="{28A0092B-C50C-407E-A947-70E740481C1C}">
                           <a14:useLocalDpi xmlns:a14="http://schemas.microsoft.com/office/drawing/2010/main" val="0"/>
@@ -20159,7 +18848,7 @@
                     <pic:cNvPicPr/>
                   </pic:nvPicPr>
                   <pic:blipFill>
-                    <a:blip r:embed="rId22">
+                    <a:blip r:embed="rId23">
                       <a:extLst>
                         <a:ext uri="{28A0092B-C50C-407E-A947-70E740481C1C}">
                           <a14:useLocalDpi xmlns:a14="http://schemas.microsoft.com/office/drawing/2010/main" val="0"/>
@@ -20236,7 +18925,7 @@
                     <pic:cNvPicPr/>
                   </pic:nvPicPr>
                   <pic:blipFill>
-                    <a:blip r:embed="rId23">
+                    <a:blip r:embed="rId24">
                       <a:extLst>
                         <a:ext uri="{28A0092B-C50C-407E-A947-70E740481C1C}">
                           <a14:useLocalDpi xmlns:a14="http://schemas.microsoft.com/office/drawing/2010/main" val="0"/>
@@ -20603,27 +19292,7 @@
           <w:szCs w:val="28"/>
           <w:lang w:val="en-IN"/>
         </w:rPr>
-        <w:t>, assigned a strict </w:t>
-      </w:r>
-      <w:proofErr w:type="spellStart"/>
-      <w:r>
-        <w:rPr>
-          <w:rFonts w:ascii="Times New Roman" w:hAnsi="Times New Roman" w:cs="Times New Roman"/>
-          <w:sz w:val="24"/>
-          <w:szCs w:val="28"/>
-          <w:lang w:val="en-IN"/>
-        </w:rPr>
-        <w:t>sla_days</w:t>
-      </w:r>
-      <w:proofErr w:type="spellEnd"/>
-      <w:r>
-        <w:rPr>
-          <w:rFonts w:ascii="Times New Roman" w:hAnsi="Times New Roman" w:cs="Times New Roman"/>
-          <w:sz w:val="24"/>
-          <w:szCs w:val="28"/>
-          <w:lang w:val="en-IN"/>
-        </w:rPr>
-        <w:t> of </w:t>
+        <w:t>, assigned a strict sla_days of </w:t>
       </w:r>
       <w:r>
         <w:rPr>
@@ -20764,27 +19433,7 @@
           <w:szCs w:val="28"/>
           <w:lang w:val="en-IN"/>
         </w:rPr>
-        <w:t>, assigned a standard </w:t>
-      </w:r>
-      <w:proofErr w:type="spellStart"/>
-      <w:r>
-        <w:rPr>
-          <w:rFonts w:ascii="Times New Roman" w:hAnsi="Times New Roman" w:cs="Times New Roman"/>
-          <w:sz w:val="24"/>
-          <w:szCs w:val="28"/>
-          <w:lang w:val="en-IN"/>
-        </w:rPr>
-        <w:t>sla_days</w:t>
-      </w:r>
-      <w:proofErr w:type="spellEnd"/>
-      <w:r>
-        <w:rPr>
-          <w:rFonts w:ascii="Times New Roman" w:hAnsi="Times New Roman" w:cs="Times New Roman"/>
-          <w:sz w:val="24"/>
-          <w:szCs w:val="28"/>
-          <w:lang w:val="en-IN"/>
-        </w:rPr>
-        <w:t> of </w:t>
+        <w:t>, assigned a standard sla_days of </w:t>
       </w:r>
       <w:r>
         <w:rPr>
@@ -21041,7 +19690,6 @@
         </w:rPr>
         <w:t>The "</w:t>
       </w:r>
-      <w:proofErr w:type="spellStart"/>
       <w:proofErr w:type="gramStart"/>
       <w:r>
         <w:rPr>
@@ -21052,7 +19700,6 @@
         </w:rPr>
         <w:t>Non Profit</w:t>
       </w:r>
-      <w:proofErr w:type="spellEnd"/>
       <w:proofErr w:type="gramEnd"/>
       <w:r>
         <w:rPr>
@@ -21061,67 +19708,7 @@
           <w:szCs w:val="28"/>
           <w:lang w:val="en-IN"/>
         </w:rPr>
-        <w:t xml:space="preserve"> Agent" project was conceptualized to solve the critical inefficiency of training junior staff to handle sensitive, high-stakes donor communications. The final product is a fully containerized, Agentic AI platform built upon a decoupled Microservices architecture. The system successfully utilizes a </w:t>
-      </w:r>
-      <w:proofErr w:type="spellStart"/>
-      <w:r>
-        <w:rPr>
-          <w:rFonts w:ascii="Times New Roman" w:hAnsi="Times New Roman" w:cs="Times New Roman"/>
-          <w:sz w:val="24"/>
-          <w:szCs w:val="28"/>
-          <w:lang w:val="en-IN"/>
-        </w:rPr>
-        <w:t>FastAPI</w:t>
-      </w:r>
-      <w:proofErr w:type="spellEnd"/>
-      <w:r>
-        <w:rPr>
-          <w:rFonts w:ascii="Times New Roman" w:hAnsi="Times New Roman" w:cs="Times New Roman"/>
-          <w:sz w:val="24"/>
-          <w:szCs w:val="28"/>
-          <w:lang w:val="en-IN"/>
-        </w:rPr>
-        <w:t xml:space="preserve"> backend to orchestrate complex reasoning pipelines, while providing a seamless, zero-code experience for the user via a </w:t>
-      </w:r>
-      <w:proofErr w:type="spellStart"/>
-      <w:r>
-        <w:rPr>
-          <w:rFonts w:ascii="Times New Roman" w:hAnsi="Times New Roman" w:cs="Times New Roman"/>
-          <w:sz w:val="24"/>
-          <w:szCs w:val="28"/>
-          <w:lang w:val="en-IN"/>
-        </w:rPr>
-        <w:t>Streamlit</w:t>
-      </w:r>
-      <w:proofErr w:type="spellEnd"/>
-      <w:r>
-        <w:rPr>
-          <w:rFonts w:ascii="Times New Roman" w:hAnsi="Times New Roman" w:cs="Times New Roman"/>
-          <w:sz w:val="24"/>
-          <w:szCs w:val="28"/>
-          <w:lang w:val="en-IN"/>
-        </w:rPr>
-        <w:t xml:space="preserve"> frontend. By integrating the Google Gemini 2.5 Flash Large Language Model (LLM) with a local </w:t>
-      </w:r>
-      <w:proofErr w:type="spellStart"/>
-      <w:r>
-        <w:rPr>
-          <w:rFonts w:ascii="Times New Roman" w:hAnsi="Times New Roman" w:cs="Times New Roman"/>
-          <w:sz w:val="24"/>
-          <w:szCs w:val="28"/>
-          <w:lang w:val="en-IN"/>
-        </w:rPr>
-        <w:t>ChromaDB</w:t>
-      </w:r>
-      <w:proofErr w:type="spellEnd"/>
-      <w:r>
-        <w:rPr>
-          <w:rFonts w:ascii="Times New Roman" w:hAnsi="Times New Roman" w:cs="Times New Roman"/>
-          <w:sz w:val="24"/>
-          <w:szCs w:val="28"/>
-          <w:lang w:val="en-IN"/>
-        </w:rPr>
-        <w:t xml:space="preserve"> Retrieval-Augmented Generation (RAG) database, the application forces the AI to strictly adhere to private organizational policies. Furthermore, the integration of an Agentic Triage workflow allows the system to autonomously parse raw emails, calculate urgency, assign SLAs, and dynamically synthesize graded training quizzes. The entire architecture was ultimately packaged using Docker and automated via a GitHub Actions CI/CD pipeline.</w:t>
+        <w:t xml:space="preserve"> Agent" project was conceptualized to solve the critical inefficiency of training junior staff to handle sensitive, high-stakes donor communications. The final product is a fully containerized, Agentic AI platform built upon a decoupled Microservices architecture. The system successfully utilizes a FastAPI backend to orchestrate complex reasoning pipelines, while providing a seamless, zero-code experience for the user via a Streamlit frontend. By integrating the Google Gemini 2.5 Flash Large Language Model (LLM) with a local ChromaDB Retrieval-Augmented Generation (RAG) database, the application forces the AI to strictly adhere to private organizational policies. Furthermore, the integration of an Agentic Triage workflow allows the system to autonomously parse raw emails, calculate urgency, assign SLAs, and dynamically synthesize graded training quizzes. The entire architecture was ultimately packaged using Docker and automated via a GitHub Actions CI/CD pipeline.</w:t>
       </w:r>
     </w:p>
     <w:p>
@@ -21453,27 +20040,7 @@
           <w:szCs w:val="28"/>
           <w:lang w:val="en-IN"/>
         </w:rPr>
-        <w:t xml:space="preserve">Hardware Constraints for Vectorization: Because the </w:t>
-      </w:r>
-      <w:proofErr w:type="spellStart"/>
-      <w:r>
-        <w:rPr>
-          <w:rFonts w:ascii="Times New Roman" w:hAnsi="Times New Roman" w:cs="Times New Roman"/>
-          <w:sz w:val="24"/>
-          <w:szCs w:val="28"/>
-          <w:lang w:val="en-IN"/>
-        </w:rPr>
-        <w:t>ChromaDB</w:t>
-      </w:r>
-      <w:proofErr w:type="spellEnd"/>
-      <w:r>
-        <w:rPr>
-          <w:rFonts w:ascii="Times New Roman" w:hAnsi="Times New Roman" w:cs="Times New Roman"/>
-          <w:sz w:val="24"/>
-          <w:szCs w:val="28"/>
-          <w:lang w:val="en-IN"/>
-        </w:rPr>
-        <w:t xml:space="preserve"> persistent client ingests and mathematically embeds PDF documents locally, the system requires a baseline amount of local RAM and CPU power, which may be limiting on significantly older hardware.</w:t>
+        <w:t>Hardware Constraints for Vectorization: Because the ChromaDB persistent client ingests and mathematically embeds PDF documents locally, the system requires a baseline amount of local RAM and CPU power, which may be limiting on significantly older hardware.</w:t>
       </w:r>
     </w:p>
     <w:p>
@@ -21813,7 +20380,6 @@
         </w:rPr>
         <w:t xml:space="preserve">While the current architecture of the </w:t>
       </w:r>
-      <w:proofErr w:type="spellStart"/>
       <w:proofErr w:type="gramStart"/>
       <w:r>
         <w:rPr>
@@ -21824,7 +20390,6 @@
         </w:rPr>
         <w:t>Non Profit</w:t>
       </w:r>
-      <w:proofErr w:type="spellEnd"/>
       <w:proofErr w:type="gramEnd"/>
       <w:r>
         <w:rPr>
@@ -21833,27 +20398,7 @@
           <w:szCs w:val="28"/>
           <w:lang w:val="en-IN"/>
         </w:rPr>
-        <w:t xml:space="preserve"> Agent successfully </w:t>
-      </w:r>
-      <w:proofErr w:type="spellStart"/>
-      <w:r>
-        <w:rPr>
-          <w:rFonts w:ascii="Times New Roman" w:hAnsi="Times New Roman" w:cs="Times New Roman"/>
-          <w:sz w:val="24"/>
-          <w:szCs w:val="28"/>
-          <w:lang w:val="en-IN"/>
-        </w:rPr>
-        <w:t>fulfills</w:t>
-      </w:r>
-      <w:proofErr w:type="spellEnd"/>
-      <w:r>
-        <w:rPr>
-          <w:rFonts w:ascii="Times New Roman" w:hAnsi="Times New Roman" w:cs="Times New Roman"/>
-          <w:sz w:val="24"/>
-          <w:szCs w:val="28"/>
-          <w:lang w:val="en-IN"/>
-        </w:rPr>
-        <w:t xml:space="preserve"> its primary objectives, the decoupled Microservices design allows for several highly impactful future expansions:</w:t>
+        <w:t xml:space="preserve"> Agent successfully fulfills its primary objectives, the decoupled Microservices design allows for several highly impactful future expansions:</w:t>
       </w:r>
     </w:p>
     <w:p>
@@ -21907,27 +20452,7 @@
           <w:szCs w:val="28"/>
           <w:lang w:val="en-IN"/>
         </w:rPr>
-        <w:t xml:space="preserve">Persistent Metric Tracking (PostgreSQL): Currently, trainee quiz scores are stored ephemerally within the </w:t>
-      </w:r>
-      <w:proofErr w:type="spellStart"/>
-      <w:r>
-        <w:rPr>
-          <w:rFonts w:ascii="Times New Roman" w:hAnsi="Times New Roman" w:cs="Times New Roman"/>
-          <w:sz w:val="24"/>
-          <w:szCs w:val="28"/>
-          <w:lang w:val="en-IN"/>
-        </w:rPr>
-        <w:t>Streamlit</w:t>
-      </w:r>
-      <w:proofErr w:type="spellEnd"/>
-      <w:r>
-        <w:rPr>
-          <w:rFonts w:ascii="Times New Roman" w:hAnsi="Times New Roman" w:cs="Times New Roman"/>
-          <w:sz w:val="24"/>
-          <w:szCs w:val="28"/>
-          <w:lang w:val="en-IN"/>
-        </w:rPr>
-        <w:t xml:space="preserve"> session state. Integrating a persistent relational database, such as PostgreSQL, would allow management to track the long-term learning curves and compliance pass rates of individual employees over time.</w:t>
+        <w:t>Persistent Metric Tracking (PostgreSQL): Currently, trainee quiz scores are stored ephemerally within the Streamlit session state. Integrating a persistent relational database, such as PostgreSQL, would allow management to track the long-term learning curves and compliance pass rates of individual employees over time.</w:t>
       </w:r>
     </w:p>
     <w:p>
@@ -21954,47 +20479,7 @@
           <w:szCs w:val="28"/>
           <w:lang w:val="en-IN"/>
         </w:rPr>
-        <w:t xml:space="preserve">Advanced Multi-Agent Orchestration: The current routing logic relies on linear prompt engineering. Future iterations could transition to heavy multi-agent frameworks (such as </w:t>
-      </w:r>
-      <w:proofErr w:type="spellStart"/>
-      <w:r>
-        <w:rPr>
-          <w:rFonts w:ascii="Times New Roman" w:hAnsi="Times New Roman" w:cs="Times New Roman"/>
-          <w:sz w:val="24"/>
-          <w:szCs w:val="28"/>
-          <w:lang w:val="en-IN"/>
-        </w:rPr>
-        <w:t>CrewAI</w:t>
-      </w:r>
-      <w:proofErr w:type="spellEnd"/>
-      <w:r>
-        <w:rPr>
-          <w:rFonts w:ascii="Times New Roman" w:hAnsi="Times New Roman" w:cs="Times New Roman"/>
-          <w:sz w:val="24"/>
-          <w:szCs w:val="28"/>
-          <w:lang w:val="en-IN"/>
-        </w:rPr>
-        <w:t xml:space="preserve"> or </w:t>
-      </w:r>
-      <w:proofErr w:type="spellStart"/>
-      <w:r>
-        <w:rPr>
-          <w:rFonts w:ascii="Times New Roman" w:hAnsi="Times New Roman" w:cs="Times New Roman"/>
-          <w:sz w:val="24"/>
-          <w:szCs w:val="28"/>
-          <w:lang w:val="en-IN"/>
-        </w:rPr>
-        <w:t>AutoGen</w:t>
-      </w:r>
-      <w:proofErr w:type="spellEnd"/>
-      <w:r>
-        <w:rPr>
-          <w:rFonts w:ascii="Times New Roman" w:hAnsi="Times New Roman" w:cs="Times New Roman"/>
-          <w:sz w:val="24"/>
-          <w:szCs w:val="28"/>
-          <w:lang w:val="en-IN"/>
-        </w:rPr>
-        <w:t>). This would allow the deployment of highly specialized sub-agents (e.g., a "Legal Agent" checking for lawsuit risks, and a "Finance Agent" checking refund limits) communicating with each other before finalizing the triage SLA.</w:t>
+        <w:t>Advanced Multi-Agent Orchestration: The current routing logic relies on linear prompt engineering. Future iterations could transition to heavy multi-agent frameworks (such as CrewAI or AutoGen). This would allow the deployment of highly specialized sub-agents (e.g., a "Legal Agent" checking for lawsuit risks, and a "Finance Agent" checking refund limits) communicating with each other before finalizing the triage SLA.</w:t>
       </w:r>
     </w:p>
     <w:p>
@@ -22204,27 +20689,7 @@
           <w:szCs w:val="28"/>
           <w:lang w:val="en-IN"/>
         </w:rPr>
-        <w:t> Advances in Neural Information Processing Systems (</w:t>
-      </w:r>
-      <w:proofErr w:type="spellStart"/>
-      <w:r>
-        <w:rPr>
-          <w:rFonts w:ascii="Times New Roman" w:hAnsi="Times New Roman" w:cs="Times New Roman"/>
-          <w:sz w:val="24"/>
-          <w:szCs w:val="28"/>
-          <w:lang w:val="en-IN"/>
-        </w:rPr>
-        <w:t>NeurIPS</w:t>
-      </w:r>
-      <w:proofErr w:type="spellEnd"/>
-      <w:r>
-        <w:rPr>
-          <w:rFonts w:ascii="Times New Roman" w:hAnsi="Times New Roman" w:cs="Times New Roman"/>
-          <w:sz w:val="24"/>
-          <w:szCs w:val="28"/>
-          <w:lang w:val="en-IN"/>
-        </w:rPr>
-        <w:t>), 33, 9459-9474. (Core foundational paper for RAG architectures).</w:t>
+        <w:t> Advances in Neural Information Processing Systems (NeurIPS), 33, 9459-9474. (Core foundational paper for RAG architectures).</w:t>
       </w:r>
     </w:p>
     <w:p>
@@ -22269,7 +20734,7 @@
         </w:rPr>
         <w:t> Retrieved from </w:t>
       </w:r>
-      <w:hyperlink r:id="rId24" w:history="1">
+      <w:hyperlink r:id="rId25" w:history="1">
         <w:r>
           <w:rPr>
             <w:rStyle w:val="Hyperlink"/>
@@ -22311,29 +20776,8 @@
           <w:szCs w:val="28"/>
           <w:lang w:val="en-IN"/>
         </w:rPr>
-        <w:t>[3] </w:t>
-      </w:r>
-      <w:proofErr w:type="spellStart"/>
-      <w:r>
-        <w:rPr>
-          <w:rFonts w:ascii="Times New Roman" w:hAnsi="Times New Roman" w:cs="Times New Roman"/>
-          <w:sz w:val="24"/>
-          <w:szCs w:val="28"/>
-          <w:lang w:val="en-IN"/>
-        </w:rPr>
-        <w:t>FastAPI</w:t>
-      </w:r>
-      <w:proofErr w:type="spellEnd"/>
-      <w:r>
-        <w:rPr>
-          <w:rFonts w:ascii="Times New Roman" w:hAnsi="Times New Roman" w:cs="Times New Roman"/>
-          <w:sz w:val="24"/>
-          <w:szCs w:val="28"/>
-          <w:lang w:val="en-IN"/>
-        </w:rPr>
-        <w:t xml:space="preserve"> Framework. </w:t>
-      </w:r>
-      <w:proofErr w:type="spellStart"/>
+        <w:t>[3] FastAPI Framework. </w:t>
+      </w:r>
       <w:r>
         <w:rPr>
           <w:rFonts w:ascii="Times New Roman" w:hAnsi="Times New Roman" w:cs="Times New Roman"/>
@@ -22343,19 +20787,7 @@
           <w:szCs w:val="28"/>
           <w:lang w:val="en-IN"/>
         </w:rPr>
-        <w:t>FastAPI</w:t>
-      </w:r>
-      <w:proofErr w:type="spellEnd"/>
-      <w:r>
-        <w:rPr>
-          <w:rFonts w:ascii="Times New Roman" w:hAnsi="Times New Roman" w:cs="Times New Roman"/>
-          <w:i/>
-          <w:iCs/>
-          <w:sz w:val="24"/>
-          <w:szCs w:val="28"/>
-          <w:lang w:val="en-IN"/>
-        </w:rPr>
-        <w:t>: High performance, easy to learn, fast to code, ready for production.</w:t>
+        <w:t>FastAPI: High performance, easy to learn, fast to code, ready for production.</w:t>
       </w:r>
       <w:r>
         <w:rPr>
@@ -22366,7 +20798,7 @@
         </w:rPr>
         <w:t> Retrieved from </w:t>
       </w:r>
-      <w:hyperlink r:id="rId25" w:history="1">
+      <w:hyperlink r:id="rId26" w:history="1">
         <w:r>
           <w:rPr>
             <w:rStyle w:val="Hyperlink"/>
@@ -22385,27 +20817,7 @@
           <w:szCs w:val="28"/>
           <w:lang w:val="en-IN"/>
         </w:rPr>
-        <w:t xml:space="preserve"> (Referenced for asynchronous REST routing and </w:t>
-      </w:r>
-      <w:proofErr w:type="spellStart"/>
-      <w:r>
-        <w:rPr>
-          <w:rFonts w:ascii="Times New Roman" w:hAnsi="Times New Roman" w:cs="Times New Roman"/>
-          <w:sz w:val="24"/>
-          <w:szCs w:val="28"/>
-          <w:lang w:val="en-IN"/>
-        </w:rPr>
-        <w:t>Pydantic</w:t>
-      </w:r>
-      <w:proofErr w:type="spellEnd"/>
-      <w:r>
-        <w:rPr>
-          <w:rFonts w:ascii="Times New Roman" w:hAnsi="Times New Roman" w:cs="Times New Roman"/>
-          <w:sz w:val="24"/>
-          <w:szCs w:val="28"/>
-          <w:lang w:val="en-IN"/>
-        </w:rPr>
-        <w:t xml:space="preserve"> data validation).</w:t>
+        <w:t> (Referenced for asynchronous REST routing and Pydantic data validation).</w:t>
       </w:r>
     </w:p>
     <w:p>
@@ -22428,27 +20840,7 @@
           <w:szCs w:val="28"/>
           <w:lang w:val="en-IN"/>
         </w:rPr>
-        <w:t>[4] </w:t>
-      </w:r>
-      <w:proofErr w:type="spellStart"/>
-      <w:r>
-        <w:rPr>
-          <w:rFonts w:ascii="Times New Roman" w:hAnsi="Times New Roman" w:cs="Times New Roman"/>
-          <w:sz w:val="24"/>
-          <w:szCs w:val="28"/>
-          <w:lang w:val="en-IN"/>
-        </w:rPr>
-        <w:t>Streamlit</w:t>
-      </w:r>
-      <w:proofErr w:type="spellEnd"/>
-      <w:r>
-        <w:rPr>
-          <w:rFonts w:ascii="Times New Roman" w:hAnsi="Times New Roman" w:cs="Times New Roman"/>
-          <w:sz w:val="24"/>
-          <w:szCs w:val="28"/>
-          <w:lang w:val="en-IN"/>
-        </w:rPr>
-        <w:t>. </w:t>
+        <w:t>[4] Streamlit. </w:t>
       </w:r>
       <w:r>
         <w:rPr>
@@ -22470,7 +20862,7 @@
         </w:rPr>
         <w:t> Retrieved from </w:t>
       </w:r>
-      <w:hyperlink r:id="rId26" w:history="1">
+      <w:hyperlink r:id="rId27" w:history="1">
         <w:r>
           <w:rPr>
             <w:rStyle w:val="Hyperlink"/>
@@ -22512,29 +20904,8 @@
           <w:szCs w:val="28"/>
           <w:lang w:val="en-IN"/>
         </w:rPr>
-        <w:t>[5] </w:t>
-      </w:r>
-      <w:proofErr w:type="spellStart"/>
-      <w:r>
-        <w:rPr>
-          <w:rFonts w:ascii="Times New Roman" w:hAnsi="Times New Roman" w:cs="Times New Roman"/>
-          <w:sz w:val="24"/>
-          <w:szCs w:val="28"/>
-          <w:lang w:val="en-IN"/>
-        </w:rPr>
-        <w:t>LangChain</w:t>
-      </w:r>
-      <w:proofErr w:type="spellEnd"/>
-      <w:r>
-        <w:rPr>
-          <w:rFonts w:ascii="Times New Roman" w:hAnsi="Times New Roman" w:cs="Times New Roman"/>
-          <w:sz w:val="24"/>
-          <w:szCs w:val="28"/>
-          <w:lang w:val="en-IN"/>
-        </w:rPr>
-        <w:t xml:space="preserve"> Contributors. (2024). </w:t>
-      </w:r>
-      <w:proofErr w:type="spellStart"/>
+        <w:t>[5] LangChain Contributors. (2024). </w:t>
+      </w:r>
       <w:r>
         <w:rPr>
           <w:rFonts w:ascii="Times New Roman" w:hAnsi="Times New Roman" w:cs="Times New Roman"/>
@@ -22544,19 +20915,7 @@
           <w:szCs w:val="28"/>
           <w:lang w:val="en-IN"/>
         </w:rPr>
-        <w:t>LangChain</w:t>
-      </w:r>
-      <w:proofErr w:type="spellEnd"/>
-      <w:r>
-        <w:rPr>
-          <w:rFonts w:ascii="Times New Roman" w:hAnsi="Times New Roman" w:cs="Times New Roman"/>
-          <w:i/>
-          <w:iCs/>
-          <w:sz w:val="24"/>
-          <w:szCs w:val="28"/>
-          <w:lang w:val="en-IN"/>
-        </w:rPr>
-        <w:t>: Building applications with LLMs through composability.</w:t>
+        <w:t>LangChain: Building applications with LLMs through composability.</w:t>
       </w:r>
       <w:r>
         <w:rPr>
@@ -22567,7 +20926,7 @@
         </w:rPr>
         <w:t> Retrieved from </w:t>
       </w:r>
-      <w:hyperlink r:id="rId27" w:history="1">
+      <w:hyperlink r:id="rId28" w:history="1">
         <w:r>
           <w:rPr>
             <w:rStyle w:val="Hyperlink"/>
@@ -22586,27 +20945,7 @@
           <w:szCs w:val="28"/>
           <w:lang w:val="en-IN"/>
         </w:rPr>
-        <w:t xml:space="preserve"> (Referenced for </w:t>
-      </w:r>
-      <w:proofErr w:type="spellStart"/>
-      <w:r>
-        <w:rPr>
-          <w:rFonts w:ascii="Times New Roman" w:hAnsi="Times New Roman" w:cs="Times New Roman"/>
-          <w:sz w:val="24"/>
-          <w:szCs w:val="28"/>
-          <w:lang w:val="en-IN"/>
-        </w:rPr>
-        <w:t>PyPDFLoader</w:t>
-      </w:r>
-      <w:proofErr w:type="spellEnd"/>
-      <w:r>
-        <w:rPr>
-          <w:rFonts w:ascii="Times New Roman" w:hAnsi="Times New Roman" w:cs="Times New Roman"/>
-          <w:sz w:val="24"/>
-          <w:szCs w:val="28"/>
-          <w:lang w:val="en-IN"/>
-        </w:rPr>
-        <w:t xml:space="preserve"> document ingestion and chunking mechanics).</w:t>
+        <w:t> (Referenced for PyPDFLoader document ingestion and chunking mechanics).</w:t>
       </w:r>
     </w:p>
     <w:p>
@@ -22651,7 +20990,7 @@
         </w:rPr>
         <w:t> Retrieved from </w:t>
       </w:r>
-      <w:hyperlink r:id="rId28" w:history="1">
+      <w:hyperlink r:id="rId29" w:history="1">
         <w:r>
           <w:rPr>
             <w:rStyle w:val="Hyperlink"/>
@@ -22715,7 +21054,7 @@
         </w:rPr>
         <w:t> Retrieved from </w:t>
       </w:r>
-      <w:hyperlink r:id="rId29" w:history="1">
+      <w:hyperlink r:id="rId30" w:history="1">
         <w:r>
           <w:rPr>
             <w:rStyle w:val="Hyperlink"/>
@@ -22779,7 +21118,7 @@
         </w:rPr>
         <w:t> Retrieved from </w:t>
       </w:r>
-      <w:hyperlink r:id="rId30" w:history="1">
+      <w:hyperlink r:id="rId31" w:history="1">
         <w:r>
           <w:rPr>
             <w:rStyle w:val="Hyperlink"/>

</xml_diff>